<commit_message>
actualización documento fase 2 individual mcc
</commit_message>
<xml_diff>
--- a/Fase 2/Evidencias Individuales/Cuevas_Matias_2.1_APT122_DiarioReflexionFase2.docx
+++ b/Fase 2/Evidencias Individuales/Cuevas_Matias_2.1_APT122_DiarioReflexionFase2.docx
@@ -1,6 +1,6 @@
 
 <file path=word/document.xml><?xml version="1.0" encoding="utf-8"?>
-<w:document xmlns:wpc="http://schemas.microsoft.com/office/word/2010/wordprocessingCanvas" xmlns:cx="http://schemas.microsoft.com/office/drawing/2014/chartex" xmlns:mc="http://schemas.openxmlformats.org/markup-compatibility/2006" xmlns:o="urn:schemas-microsoft-com:office:office" xmlns:r="http://schemas.openxmlformats.org/officeDocument/2006/relationships" xmlns:m="http://schemas.openxmlformats.org/officeDocument/2006/math" xmlns:v="urn:schemas-microsoft-com:vml" xmlns:wp14="http://schemas.microsoft.com/office/word/2010/wordprocessingDrawing" xmlns:wp="http://schemas.openxmlformats.org/drawingml/2006/wordprocessingDrawing" xmlns:w10="urn:schemas-microsoft-com:office:word" xmlns:w="http://schemas.openxmlformats.org/wordprocessingml/2006/main" xmlns:w14="http://schemas.microsoft.com/office/word/2010/wordml" xmlns:w15="http://schemas.microsoft.com/office/word/2012/wordml" xmlns:w16se="http://schemas.microsoft.com/office/word/2015/wordml/symex" xmlns:wpg="http://schemas.microsoft.com/office/word/2010/wordprocessingGroup" xmlns:wpi="http://schemas.microsoft.com/office/word/2010/wordprocessingInk" xmlns:wne="http://schemas.microsoft.com/office/word/2006/wordml" xmlns:wps="http://schemas.microsoft.com/office/word/2010/wordprocessingShape" mc:Ignorable="w14 w15 w16se wp14">
+<w:document xmlns:wpc="http://schemas.microsoft.com/office/word/2010/wordprocessingCanvas" xmlns:cx="http://schemas.microsoft.com/office/drawing/2014/chartex" xmlns:cx1="http://schemas.microsoft.com/office/drawing/2015/9/8/chartex" xmlns:cx2="http://schemas.microsoft.com/office/drawing/2015/10/21/chartex" xmlns:cx3="http://schemas.microsoft.com/office/drawing/2016/5/9/chartex" xmlns:cx4="http://schemas.microsoft.com/office/drawing/2016/5/10/chartex" xmlns:cx5="http://schemas.microsoft.com/office/drawing/2016/5/11/chartex" xmlns:cx6="http://schemas.microsoft.com/office/drawing/2016/5/12/chartex" xmlns:cx7="http://schemas.microsoft.com/office/drawing/2016/5/13/chartex" xmlns:cx8="http://schemas.microsoft.com/office/drawing/2016/5/14/chartex" xmlns:mc="http://schemas.openxmlformats.org/markup-compatibility/2006" xmlns:aink="http://schemas.microsoft.com/office/drawing/2016/ink" xmlns:am3d="http://schemas.microsoft.com/office/drawing/2017/model3d" xmlns:o="urn:schemas-microsoft-com:office:office" xmlns:oel="http://schemas.microsoft.com/office/2019/extlst" xmlns:r="http://schemas.openxmlformats.org/officeDocument/2006/relationships" xmlns:m="http://schemas.openxmlformats.org/officeDocument/2006/math" xmlns:v="urn:schemas-microsoft-com:vml" xmlns:wp14="http://schemas.microsoft.com/office/word/2010/wordprocessingDrawing" xmlns:wp="http://schemas.openxmlformats.org/drawingml/2006/wordprocessingDrawing" xmlns:w10="urn:schemas-microsoft-com:office:word" xmlns:w="http://schemas.openxmlformats.org/wordprocessingml/2006/main" xmlns:w14="http://schemas.microsoft.com/office/word/2010/wordml" xmlns:w15="http://schemas.microsoft.com/office/word/2012/wordml" xmlns:w16cex="http://schemas.microsoft.com/office/word/2018/wordml/cex" xmlns:w16cid="http://schemas.microsoft.com/office/word/2016/wordml/cid" xmlns:w16="http://schemas.microsoft.com/office/word/2018/wordml" xmlns:w16du="http://schemas.microsoft.com/office/word/2023/wordml/word16du" xmlns:w16sdtdh="http://schemas.microsoft.com/office/word/2020/wordml/sdtdatahash" xmlns:w16sdtfl="http://schemas.microsoft.com/office/word/2024/wordml/sdtformatlock" xmlns:w16se="http://schemas.microsoft.com/office/word/2015/wordml/symex" xmlns:wpg="http://schemas.microsoft.com/office/word/2010/wordprocessingGroup" xmlns:wpi="http://schemas.microsoft.com/office/word/2010/wordprocessingInk" xmlns:wne="http://schemas.microsoft.com/office/word/2006/wordml" xmlns:wps="http://schemas.microsoft.com/office/word/2010/wordprocessingShape" mc:Ignorable="w14 w15 w16se w16cid w16 w16cex w16sdtdh w16sdtfl w16du wp14">
   <w:body>
     <w:p/>
     <w:tbl>
@@ -121,7 +121,25 @@
                 <w:sz w:val="24"/>
                 <w:szCs w:val="24"/>
               </w:rPr>
-              <w:t xml:space="preserve">Esta pauta tiene como objetivo ayudarte a monitorear el desarrollo de tu Proyecto APT, reflexionando sobre tus avances de acuerdo con lo planificado en la fase anterior y recibiendo retroalimentación de tus pares y docentes que te permita hacer los ajustes necesarios para cumplir con los objetivos de tu proyecto. Esta pauta debe ser respondida </w:t>
+              <w:t xml:space="preserve">Esta pauta tiene como objetivo ayudarte a monitorear el desarrollo de tu Proyecto APT, reflexionando sobre tus avances de acuerdo con lo planificado en la fase anterior y recibiendo retroalimentación de tus </w:t>
+            </w:r>
+            <w:proofErr w:type="spellStart"/>
+            <w:r>
+              <w:rPr>
+                <w:rFonts w:eastAsiaTheme="majorEastAsia"/>
+                <w:sz w:val="24"/>
+                <w:szCs w:val="24"/>
+              </w:rPr>
+              <w:t>pares</w:t>
+            </w:r>
+            <w:proofErr w:type="spellEnd"/>
+            <w:r>
+              <w:rPr>
+                <w:rFonts w:eastAsiaTheme="majorEastAsia"/>
+                <w:sz w:val="24"/>
+                <w:szCs w:val="24"/>
+              </w:rPr>
+              <w:t xml:space="preserve"> y docentes que te permita hacer los ajustes necesarios para cumplir con los objetivos de tu proyecto. Esta pauta debe ser respondida </w:t>
             </w:r>
             <w:r>
               <w:rPr>
@@ -286,7 +304,25 @@
                 <w:sz w:val="24"/>
                 <w:szCs w:val="24"/>
               </w:rPr>
-              <w:t>1. Mira tu carta Gantt y reflexiona sobre los avances de tu Proyecto APT</w:t>
+              <w:t xml:space="preserve">1. Mira </w:t>
+            </w:r>
+            <w:proofErr w:type="spellStart"/>
+            <w:r>
+              <w:rPr>
+                <w:rFonts w:eastAsiaTheme="majorEastAsia"/>
+                <w:sz w:val="24"/>
+                <w:szCs w:val="24"/>
+              </w:rPr>
+              <w:t>tu</w:t>
+            </w:r>
+            <w:proofErr w:type="spellEnd"/>
+            <w:r>
+              <w:rPr>
+                <w:rFonts w:eastAsiaTheme="majorEastAsia"/>
+                <w:sz w:val="24"/>
+                <w:szCs w:val="24"/>
+              </w:rPr>
+              <w:t xml:space="preserve"> carta Gantt y reflexiona sobre los avances de tu Proyecto APT</w:t>
             </w:r>
           </w:p>
         </w:tc>
@@ -306,7 +342,6 @@
               <w:jc w:val="both"/>
               <w:rPr>
                 <w:rFonts w:eastAsiaTheme="majorEastAsia"/>
-                <w:color w:val="767171" w:themeColor="background2" w:themeShade="80"/>
                 <w:sz w:val="24"/>
                 <w:szCs w:val="24"/>
               </w:rPr>
@@ -319,6 +354,34 @@
               </w:rPr>
               <w:t>¿Has podido cumplir todas las actividades en los tiempos definidos? ¿Qué factores han facilitado o dificultado el desarrollo de las actividades de tu plan de trabajo?</w:t>
             </w:r>
+          </w:p>
+          <w:p>
+            <w:pPr>
+              <w:jc w:val="both"/>
+            </w:pPr>
+            <w:r>
+              <w:rPr>
+                <w:rFonts w:eastAsiaTheme="majorEastAsia"/>
+                <w:color w:val="767171" w:themeColor="background2" w:themeShade="80"/>
+                <w:sz w:val="24"/>
+                <w:szCs w:val="24"/>
+              </w:rPr>
+              <w:t xml:space="preserve">En general hemos podido cumplir con la mayoría de las actividades en los plazos definidos dentro de </w:t>
+            </w:r>
+            <w:r>
+              <w:t>la carta Gantt, aunque en algunos casos hubo pequeños retrasos por la coordinación de tiempos entre los integrantes. Un factor que facilitó el avance fue la claridad en las tareas iniciales y la buena comunicación que hemos mantenido. Sin embargo, la disponibilidad de tiempo personal y algunos imprevistos técnicos generaron ciertas dificultades que nos obligaron a reorganizar actividades.</w:t>
+            </w:r>
+          </w:p>
+          <w:p>
+            <w:pPr>
+              <w:jc w:val="both"/>
+              <w:rPr>
+                <w:rFonts w:eastAsiaTheme="majorEastAsia"/>
+                <w:color w:val="767171" w:themeColor="background2" w:themeShade="80"/>
+                <w:sz w:val="24"/>
+                <w:szCs w:val="24"/>
+              </w:rPr>
+            </w:pPr>
           </w:p>
           <w:p>
             <w:pPr>
@@ -468,15 +531,9 @@
             </w:pPr>
           </w:p>
           <w:p>
-            <w:pPr>
-              <w:jc w:val="both"/>
-              <w:rPr>
-                <w:rFonts w:ascii="Calibri" w:hAnsi="Calibri"/>
-                <w:b/>
-                <w:bCs/>
-                <w:color w:val="1F4E79" w:themeColor="accent1" w:themeShade="80"/>
-              </w:rPr>
-            </w:pPr>
+            <w:r>
+              <w:t>Las principales dificultades las hemos enfrentado con una mejor planificación semanal, estableciendo metas más concretas y realistas. Además, hemos acordado reuniones cortas de seguimiento para detectar problemas a tiempo y darles solución antes de que se acumulen. También hemos utilizado recursos digitales (como herramientas de comunicación y almacenamiento en la nube) para evitar retrasos por temas de coordinación.</w:t>
+            </w:r>
           </w:p>
           <w:p>
             <w:pPr>
@@ -685,7 +742,6 @@
                 <w:sz w:val="24"/>
                 <w:szCs w:val="24"/>
               </w:rPr>
-              <w:lastRenderedPageBreak/>
               <w:t>¿Cómo evalúas tu</w:t>
             </w:r>
             <w:r>
@@ -733,15 +789,9 @@
             </w:pPr>
           </w:p>
           <w:p>
-            <w:pPr>
-              <w:jc w:val="both"/>
-              <w:rPr>
-                <w:rFonts w:ascii="Calibri" w:hAnsi="Calibri"/>
-                <w:b/>
-                <w:bCs/>
-                <w:color w:val="1F4E79" w:themeColor="accent1" w:themeShade="80"/>
-              </w:rPr>
-            </w:pPr>
+            <w:r>
+              <w:t>Considero que mi trabajo ha sido responsable y constante. Destaco la disposición a colaborar y aportar ideas para resolver problemas, además del compromiso con las tareas asignadas. No obstante, pienso que puedo mejorar en la gestión del tiempo, organizándome mejor para no dejar actividades para última hora y manteniendo un ritmo de avance más parejo.</w:t>
+            </w:r>
           </w:p>
           <w:p>
             <w:pPr>
@@ -870,15 +920,12 @@
             </w:pPr>
           </w:p>
           <w:p>
-            <w:pPr>
-              <w:jc w:val="both"/>
-              <w:rPr>
-                <w:rFonts w:ascii="Calibri" w:hAnsi="Calibri"/>
-                <w:b/>
-                <w:bCs/>
-                <w:color w:val="1F4E79" w:themeColor="accent1" w:themeShade="80"/>
-              </w:rPr>
-            </w:pPr>
+            <w:r>
+              <w:t>Me gustaría aclarar cómo debemos presentar las próximas evidencias y si existe algún formato recomendado por parte de los docentes para estandarizar la entrega. También quisiera confirmar si los avances actuales van en la dirección correcta respecto a los objetivos del proyecto, o si es necesario profundizar más en ciertos aspectos técnicos.</w:t>
+            </w:r>
+            <w:r>
+              <w:t xml:space="preserve"> Esto se ha comentado mediante las clases y se han ido respondiendo en cada sesión gracias a la buena disponibilidad del profesor.</w:t>
+            </w:r>
           </w:p>
           <w:p>
             <w:pPr>
@@ -1029,6 +1076,11 @@
             </w:pPr>
           </w:p>
           <w:p>
+            <w:r>
+              <w:t>Hasta el momento las actividades se han distribuido de manera equilibrada. Sin embargo, creemos que podría ser útil reasignar algunas tareas según las fortalezas de cada integrante, para optimizar tiempos. No vemos necesario agregar nuevas actividades, pero sí dar más énfasis a la documentación y revisión conjunta de los avances.</w:t>
+            </w:r>
+          </w:p>
+          <w:p>
             <w:pPr>
               <w:jc w:val="both"/>
               <w:rPr>
@@ -1139,10 +1191,18 @@
                 <w:sz w:val="24"/>
                 <w:szCs w:val="24"/>
               </w:rPr>
-              <w:t>. APT  grupal</w:t>
+              <w:t xml:space="preserve">. </w:t>
             </w:r>
-            <w:bookmarkStart w:id="0" w:name="_GoBack"/>
-            <w:bookmarkEnd w:id="0"/>
+            <w:proofErr w:type="gramStart"/>
+            <w:r>
+              <w:rPr>
+                <w:rFonts w:eastAsiaTheme="majorEastAsia"/>
+                <w:sz w:val="24"/>
+                <w:szCs w:val="24"/>
+              </w:rPr>
+              <w:t>APT  grupal</w:t>
+            </w:r>
+            <w:proofErr w:type="gramEnd"/>
           </w:p>
         </w:tc>
       </w:tr>
@@ -1176,16 +1236,11 @@
             </w:r>
           </w:p>
           <w:p>
-            <w:pPr>
-              <w:jc w:val="both"/>
-              <w:rPr>
-                <w:rFonts w:eastAsiaTheme="majorEastAsia"/>
-                <w:color w:val="767171" w:themeColor="background2" w:themeShade="80"/>
-                <w:sz w:val="24"/>
-                <w:szCs w:val="24"/>
-              </w:rPr>
-            </w:pPr>
+            <w:r>
+              <w:t>El trabajo en grupo ha sido positivo, destacamos la comunicación y la disposición a apoyarnos mutuamente. Un aspecto importante ha sido la responsabilidad individual, lo que ha permitido que el grupo avance sin depender de una sola persona. Como aspecto a mejorar, podríamos establecer un calendario más estricto de reuniones para reforzar la coordinación y evitar retrasos en las entregas.</w:t>
+            </w:r>
           </w:p>
+          <w:p/>
           <w:p>
             <w:pPr>
               <w:jc w:val="both"/>
@@ -1272,7 +1327,7 @@
 </file>
 
 <file path=word/endnotes.xml><?xml version="1.0" encoding="utf-8"?>
-<w:endnotes xmlns:wpc="http://schemas.microsoft.com/office/word/2010/wordprocessingCanvas" xmlns:cx="http://schemas.microsoft.com/office/drawing/2014/chartex" xmlns:mc="http://schemas.openxmlformats.org/markup-compatibility/2006" xmlns:o="urn:schemas-microsoft-com:office:office" xmlns:r="http://schemas.openxmlformats.org/officeDocument/2006/relationships" xmlns:m="http://schemas.openxmlformats.org/officeDocument/2006/math" xmlns:v="urn:schemas-microsoft-com:vml" xmlns:wp14="http://schemas.microsoft.com/office/word/2010/wordprocessingDrawing" xmlns:wp="http://schemas.openxmlformats.org/drawingml/2006/wordprocessingDrawing" xmlns:w10="urn:schemas-microsoft-com:office:word" xmlns:w="http://schemas.openxmlformats.org/wordprocessingml/2006/main" xmlns:w14="http://schemas.microsoft.com/office/word/2010/wordml" xmlns:w15="http://schemas.microsoft.com/office/word/2012/wordml" xmlns:w16se="http://schemas.microsoft.com/office/word/2015/wordml/symex" xmlns:wpg="http://schemas.microsoft.com/office/word/2010/wordprocessingGroup" xmlns:wpi="http://schemas.microsoft.com/office/word/2010/wordprocessingInk" xmlns:wne="http://schemas.microsoft.com/office/word/2006/wordml" xmlns:wps="http://schemas.microsoft.com/office/word/2010/wordprocessingShape" mc:Ignorable="w14 w15 w16se wp14">
+<w:endnotes xmlns:wpc="http://schemas.microsoft.com/office/word/2010/wordprocessingCanvas" xmlns:cx="http://schemas.microsoft.com/office/drawing/2014/chartex" xmlns:cx1="http://schemas.microsoft.com/office/drawing/2015/9/8/chartex" xmlns:cx2="http://schemas.microsoft.com/office/drawing/2015/10/21/chartex" xmlns:cx3="http://schemas.microsoft.com/office/drawing/2016/5/9/chartex" xmlns:cx4="http://schemas.microsoft.com/office/drawing/2016/5/10/chartex" xmlns:cx5="http://schemas.microsoft.com/office/drawing/2016/5/11/chartex" xmlns:cx6="http://schemas.microsoft.com/office/drawing/2016/5/12/chartex" xmlns:cx7="http://schemas.microsoft.com/office/drawing/2016/5/13/chartex" xmlns:cx8="http://schemas.microsoft.com/office/drawing/2016/5/14/chartex" xmlns:mc="http://schemas.openxmlformats.org/markup-compatibility/2006" xmlns:aink="http://schemas.microsoft.com/office/drawing/2016/ink" xmlns:am3d="http://schemas.microsoft.com/office/drawing/2017/model3d" xmlns:o="urn:schemas-microsoft-com:office:office" xmlns:oel="http://schemas.microsoft.com/office/2019/extlst" xmlns:r="http://schemas.openxmlformats.org/officeDocument/2006/relationships" xmlns:m="http://schemas.openxmlformats.org/officeDocument/2006/math" xmlns:v="urn:schemas-microsoft-com:vml" xmlns:wp14="http://schemas.microsoft.com/office/word/2010/wordprocessingDrawing" xmlns:wp="http://schemas.openxmlformats.org/drawingml/2006/wordprocessingDrawing" xmlns:w10="urn:schemas-microsoft-com:office:word" xmlns:w="http://schemas.openxmlformats.org/wordprocessingml/2006/main" xmlns:w14="http://schemas.microsoft.com/office/word/2010/wordml" xmlns:w15="http://schemas.microsoft.com/office/word/2012/wordml" xmlns:w16cex="http://schemas.microsoft.com/office/word/2018/wordml/cex" xmlns:w16cid="http://schemas.microsoft.com/office/word/2016/wordml/cid" xmlns:w16="http://schemas.microsoft.com/office/word/2018/wordml" xmlns:w16du="http://schemas.microsoft.com/office/word/2023/wordml/word16du" xmlns:w16sdtdh="http://schemas.microsoft.com/office/word/2020/wordml/sdtdatahash" xmlns:w16sdtfl="http://schemas.microsoft.com/office/word/2024/wordml/sdtformatlock" xmlns:w16se="http://schemas.microsoft.com/office/word/2015/wordml/symex" xmlns:wpg="http://schemas.microsoft.com/office/word/2010/wordprocessingGroup" xmlns:wpi="http://schemas.microsoft.com/office/word/2010/wordprocessingInk" xmlns:wne="http://schemas.microsoft.com/office/word/2006/wordml" xmlns:wps="http://schemas.microsoft.com/office/word/2010/wordprocessingShape" mc:Ignorable="w14 w15 w16se w16cid w16 w16cex w16sdtdh w16sdtfl w16du wp14">
   <w:endnote w:type="separator" w:id="-1">
     <w:p>
       <w:pPr>
@@ -1297,7 +1352,7 @@
 </file>
 
 <file path=word/footer1.xml><?xml version="1.0" encoding="utf-8"?>
-<w:ftr xmlns:wpc="http://schemas.microsoft.com/office/word/2010/wordprocessingCanvas" xmlns:cx="http://schemas.microsoft.com/office/drawing/2014/chartex" xmlns:mc="http://schemas.openxmlformats.org/markup-compatibility/2006" xmlns:o="urn:schemas-microsoft-com:office:office" xmlns:r="http://schemas.openxmlformats.org/officeDocument/2006/relationships" xmlns:m="http://schemas.openxmlformats.org/officeDocument/2006/math" xmlns:v="urn:schemas-microsoft-com:vml" xmlns:wp14="http://schemas.microsoft.com/office/word/2010/wordprocessingDrawing" xmlns:wp="http://schemas.openxmlformats.org/drawingml/2006/wordprocessingDrawing" xmlns:w10="urn:schemas-microsoft-com:office:word" xmlns:w="http://schemas.openxmlformats.org/wordprocessingml/2006/main" xmlns:w14="http://schemas.microsoft.com/office/word/2010/wordml" xmlns:w15="http://schemas.microsoft.com/office/word/2012/wordml" xmlns:w16se="http://schemas.microsoft.com/office/word/2015/wordml/symex" xmlns:wpg="http://schemas.microsoft.com/office/word/2010/wordprocessingGroup" xmlns:wpi="http://schemas.microsoft.com/office/word/2010/wordprocessingInk" xmlns:wne="http://schemas.microsoft.com/office/word/2006/wordml" xmlns:wps="http://schemas.microsoft.com/office/word/2010/wordprocessingShape" mc:Ignorable="w14 w15 w16se wp14">
+<w:ftr xmlns:wpc="http://schemas.microsoft.com/office/word/2010/wordprocessingCanvas" xmlns:cx="http://schemas.microsoft.com/office/drawing/2014/chartex" xmlns:cx1="http://schemas.microsoft.com/office/drawing/2015/9/8/chartex" xmlns:cx2="http://schemas.microsoft.com/office/drawing/2015/10/21/chartex" xmlns:cx3="http://schemas.microsoft.com/office/drawing/2016/5/9/chartex" xmlns:cx4="http://schemas.microsoft.com/office/drawing/2016/5/10/chartex" xmlns:cx5="http://schemas.microsoft.com/office/drawing/2016/5/11/chartex" xmlns:cx6="http://schemas.microsoft.com/office/drawing/2016/5/12/chartex" xmlns:cx7="http://schemas.microsoft.com/office/drawing/2016/5/13/chartex" xmlns:cx8="http://schemas.microsoft.com/office/drawing/2016/5/14/chartex" xmlns:mc="http://schemas.openxmlformats.org/markup-compatibility/2006" xmlns:aink="http://schemas.microsoft.com/office/drawing/2016/ink" xmlns:am3d="http://schemas.microsoft.com/office/drawing/2017/model3d" xmlns:o="urn:schemas-microsoft-com:office:office" xmlns:oel="http://schemas.microsoft.com/office/2019/extlst" xmlns:r="http://schemas.openxmlformats.org/officeDocument/2006/relationships" xmlns:m="http://schemas.openxmlformats.org/officeDocument/2006/math" xmlns:v="urn:schemas-microsoft-com:vml" xmlns:wp14="http://schemas.microsoft.com/office/word/2010/wordprocessingDrawing" xmlns:wp="http://schemas.openxmlformats.org/drawingml/2006/wordprocessingDrawing" xmlns:w10="urn:schemas-microsoft-com:office:word" xmlns:w="http://schemas.openxmlformats.org/wordprocessingml/2006/main" xmlns:w14="http://schemas.microsoft.com/office/word/2010/wordml" xmlns:w15="http://schemas.microsoft.com/office/word/2012/wordml" xmlns:w16cex="http://schemas.microsoft.com/office/word/2018/wordml/cex" xmlns:w16cid="http://schemas.microsoft.com/office/word/2016/wordml/cid" xmlns:w16="http://schemas.microsoft.com/office/word/2018/wordml" xmlns:w16du="http://schemas.microsoft.com/office/word/2023/wordml/word16du" xmlns:w16sdtdh="http://schemas.microsoft.com/office/word/2020/wordml/sdtdatahash" xmlns:w16sdtfl="http://schemas.microsoft.com/office/word/2024/wordml/sdtformatlock" xmlns:w16se="http://schemas.microsoft.com/office/word/2015/wordml/symex" xmlns:wpg="http://schemas.microsoft.com/office/word/2010/wordprocessingGroup" xmlns:wpi="http://schemas.microsoft.com/office/word/2010/wordprocessingInk" xmlns:wne="http://schemas.microsoft.com/office/word/2006/wordml" xmlns:wps="http://schemas.microsoft.com/office/word/2010/wordprocessingShape" mc:Ignorable="w14 w15 w16se w16cid w16 w16cex w16sdtdh w16sdtfl w16du wp14">
   <w:sdt>
     <w:sdtPr>
       <w:id w:val="-937982979"/>
@@ -1306,7 +1361,6 @@
         <w:docPartUnique/>
       </w:docPartObj>
     </w:sdtPr>
-    <w:sdtEndPr/>
     <w:sdtContent>
       <w:p>
         <w:pPr>
@@ -1585,7 +1639,7 @@
 </file>
 
 <file path=word/footnotes.xml><?xml version="1.0" encoding="utf-8"?>
-<w:footnotes xmlns:wpc="http://schemas.microsoft.com/office/word/2010/wordprocessingCanvas" xmlns:cx="http://schemas.microsoft.com/office/drawing/2014/chartex" xmlns:mc="http://schemas.openxmlformats.org/markup-compatibility/2006" xmlns:o="urn:schemas-microsoft-com:office:office" xmlns:r="http://schemas.openxmlformats.org/officeDocument/2006/relationships" xmlns:m="http://schemas.openxmlformats.org/officeDocument/2006/math" xmlns:v="urn:schemas-microsoft-com:vml" xmlns:wp14="http://schemas.microsoft.com/office/word/2010/wordprocessingDrawing" xmlns:wp="http://schemas.openxmlformats.org/drawingml/2006/wordprocessingDrawing" xmlns:w10="urn:schemas-microsoft-com:office:word" xmlns:w="http://schemas.openxmlformats.org/wordprocessingml/2006/main" xmlns:w14="http://schemas.microsoft.com/office/word/2010/wordml" xmlns:w15="http://schemas.microsoft.com/office/word/2012/wordml" xmlns:w16se="http://schemas.microsoft.com/office/word/2015/wordml/symex" xmlns:wpg="http://schemas.microsoft.com/office/word/2010/wordprocessingGroup" xmlns:wpi="http://schemas.microsoft.com/office/word/2010/wordprocessingInk" xmlns:wne="http://schemas.microsoft.com/office/word/2006/wordml" xmlns:wps="http://schemas.microsoft.com/office/word/2010/wordprocessingShape" mc:Ignorable="w14 w15 w16se wp14">
+<w:footnotes xmlns:wpc="http://schemas.microsoft.com/office/word/2010/wordprocessingCanvas" xmlns:cx="http://schemas.microsoft.com/office/drawing/2014/chartex" xmlns:cx1="http://schemas.microsoft.com/office/drawing/2015/9/8/chartex" xmlns:cx2="http://schemas.microsoft.com/office/drawing/2015/10/21/chartex" xmlns:cx3="http://schemas.microsoft.com/office/drawing/2016/5/9/chartex" xmlns:cx4="http://schemas.microsoft.com/office/drawing/2016/5/10/chartex" xmlns:cx5="http://schemas.microsoft.com/office/drawing/2016/5/11/chartex" xmlns:cx6="http://schemas.microsoft.com/office/drawing/2016/5/12/chartex" xmlns:cx7="http://schemas.microsoft.com/office/drawing/2016/5/13/chartex" xmlns:cx8="http://schemas.microsoft.com/office/drawing/2016/5/14/chartex" xmlns:mc="http://schemas.openxmlformats.org/markup-compatibility/2006" xmlns:aink="http://schemas.microsoft.com/office/drawing/2016/ink" xmlns:am3d="http://schemas.microsoft.com/office/drawing/2017/model3d" xmlns:o="urn:schemas-microsoft-com:office:office" xmlns:oel="http://schemas.microsoft.com/office/2019/extlst" xmlns:r="http://schemas.openxmlformats.org/officeDocument/2006/relationships" xmlns:m="http://schemas.openxmlformats.org/officeDocument/2006/math" xmlns:v="urn:schemas-microsoft-com:vml" xmlns:wp14="http://schemas.microsoft.com/office/word/2010/wordprocessingDrawing" xmlns:wp="http://schemas.openxmlformats.org/drawingml/2006/wordprocessingDrawing" xmlns:w10="urn:schemas-microsoft-com:office:word" xmlns:w="http://schemas.openxmlformats.org/wordprocessingml/2006/main" xmlns:w14="http://schemas.microsoft.com/office/word/2010/wordml" xmlns:w15="http://schemas.microsoft.com/office/word/2012/wordml" xmlns:w16cex="http://schemas.microsoft.com/office/word/2018/wordml/cex" xmlns:w16cid="http://schemas.microsoft.com/office/word/2016/wordml/cid" xmlns:w16="http://schemas.microsoft.com/office/word/2018/wordml" xmlns:w16du="http://schemas.microsoft.com/office/word/2023/wordml/word16du" xmlns:w16sdtdh="http://schemas.microsoft.com/office/word/2020/wordml/sdtdatahash" xmlns:w16sdtfl="http://schemas.microsoft.com/office/word/2024/wordml/sdtformatlock" xmlns:w16se="http://schemas.microsoft.com/office/word/2015/wordml/symex" xmlns:wpg="http://schemas.microsoft.com/office/word/2010/wordprocessingGroup" xmlns:wpi="http://schemas.microsoft.com/office/word/2010/wordprocessingInk" xmlns:wne="http://schemas.microsoft.com/office/word/2006/wordml" xmlns:wps="http://schemas.microsoft.com/office/word/2010/wordprocessingShape" mc:Ignorable="w14 w15 w16se w16cid w16 w16cex w16sdtdh w16sdtfl w16du wp14">
   <w:footnote w:type="separator" w:id="-1">
     <w:p>
       <w:pPr>
@@ -1610,7 +1664,7 @@
 </file>
 
 <file path=word/header1.xml><?xml version="1.0" encoding="utf-8"?>
-<w:hdr xmlns:wpc="http://schemas.microsoft.com/office/word/2010/wordprocessingCanvas" xmlns:cx="http://schemas.microsoft.com/office/drawing/2014/chartex" xmlns:mc="http://schemas.openxmlformats.org/markup-compatibility/2006" xmlns:o="urn:schemas-microsoft-com:office:office" xmlns:r="http://schemas.openxmlformats.org/officeDocument/2006/relationships" xmlns:m="http://schemas.openxmlformats.org/officeDocument/2006/math" xmlns:v="urn:schemas-microsoft-com:vml" xmlns:wp14="http://schemas.microsoft.com/office/word/2010/wordprocessingDrawing" xmlns:wp="http://schemas.openxmlformats.org/drawingml/2006/wordprocessingDrawing" xmlns:w10="urn:schemas-microsoft-com:office:word" xmlns:w="http://schemas.openxmlformats.org/wordprocessingml/2006/main" xmlns:w14="http://schemas.microsoft.com/office/word/2010/wordml" xmlns:w15="http://schemas.microsoft.com/office/word/2012/wordml" xmlns:w16se="http://schemas.microsoft.com/office/word/2015/wordml/symex" xmlns:wpg="http://schemas.microsoft.com/office/word/2010/wordprocessingGroup" xmlns:wpi="http://schemas.microsoft.com/office/word/2010/wordprocessingInk" xmlns:wne="http://schemas.microsoft.com/office/word/2006/wordml" xmlns:wps="http://schemas.microsoft.com/office/word/2010/wordprocessingShape" mc:Ignorable="w14 w15 w16se wp14">
+<w:hdr xmlns:wpc="http://schemas.microsoft.com/office/word/2010/wordprocessingCanvas" xmlns:cx="http://schemas.microsoft.com/office/drawing/2014/chartex" xmlns:cx1="http://schemas.microsoft.com/office/drawing/2015/9/8/chartex" xmlns:cx2="http://schemas.microsoft.com/office/drawing/2015/10/21/chartex" xmlns:cx3="http://schemas.microsoft.com/office/drawing/2016/5/9/chartex" xmlns:cx4="http://schemas.microsoft.com/office/drawing/2016/5/10/chartex" xmlns:cx5="http://schemas.microsoft.com/office/drawing/2016/5/11/chartex" xmlns:cx6="http://schemas.microsoft.com/office/drawing/2016/5/12/chartex" xmlns:cx7="http://schemas.microsoft.com/office/drawing/2016/5/13/chartex" xmlns:cx8="http://schemas.microsoft.com/office/drawing/2016/5/14/chartex" xmlns:mc="http://schemas.openxmlformats.org/markup-compatibility/2006" xmlns:aink="http://schemas.microsoft.com/office/drawing/2016/ink" xmlns:am3d="http://schemas.microsoft.com/office/drawing/2017/model3d" xmlns:o="urn:schemas-microsoft-com:office:office" xmlns:oel="http://schemas.microsoft.com/office/2019/extlst" xmlns:r="http://schemas.openxmlformats.org/officeDocument/2006/relationships" xmlns:m="http://schemas.openxmlformats.org/officeDocument/2006/math" xmlns:v="urn:schemas-microsoft-com:vml" xmlns:wp14="http://schemas.microsoft.com/office/word/2010/wordprocessingDrawing" xmlns:wp="http://schemas.openxmlformats.org/drawingml/2006/wordprocessingDrawing" xmlns:w10="urn:schemas-microsoft-com:office:word" xmlns:w="http://schemas.openxmlformats.org/wordprocessingml/2006/main" xmlns:w14="http://schemas.microsoft.com/office/word/2010/wordml" xmlns:w15="http://schemas.microsoft.com/office/word/2012/wordml" xmlns:w16cex="http://schemas.microsoft.com/office/word/2018/wordml/cex" xmlns:w16cid="http://schemas.microsoft.com/office/word/2016/wordml/cid" xmlns:w16="http://schemas.microsoft.com/office/word/2018/wordml" xmlns:w16du="http://schemas.microsoft.com/office/word/2023/wordml/word16du" xmlns:w16sdtdh="http://schemas.microsoft.com/office/word/2020/wordml/sdtdatahash" xmlns:w16sdtfl="http://schemas.microsoft.com/office/word/2024/wordml/sdtformatlock" xmlns:w16se="http://schemas.microsoft.com/office/word/2015/wordml/symex" xmlns:wpg="http://schemas.microsoft.com/office/word/2010/wordprocessingGroup" xmlns:wpi="http://schemas.microsoft.com/office/word/2010/wordprocessingInk" xmlns:wne="http://schemas.microsoft.com/office/word/2006/wordml" xmlns:wps="http://schemas.microsoft.com/office/word/2010/wordprocessingShape" mc:Ignorable="w14 w15 w16se w16cid w16 w16cex w16sdtdh w16sdtfl w16du wp14">
   <w:tbl>
     <w:tblPr>
       <w:tblStyle w:val="Tablaconcuadrcula"/>
@@ -1790,7 +1844,7 @@
 </file>
 
 <file path=word/header2.xml><?xml version="1.0" encoding="utf-8"?>
-<w:hdr xmlns:wpc="http://schemas.microsoft.com/office/word/2010/wordprocessingCanvas" xmlns:cx="http://schemas.microsoft.com/office/drawing/2014/chartex" xmlns:mc="http://schemas.openxmlformats.org/markup-compatibility/2006" xmlns:o="urn:schemas-microsoft-com:office:office" xmlns:r="http://schemas.openxmlformats.org/officeDocument/2006/relationships" xmlns:m="http://schemas.openxmlformats.org/officeDocument/2006/math" xmlns:v="urn:schemas-microsoft-com:vml" xmlns:wp14="http://schemas.microsoft.com/office/word/2010/wordprocessingDrawing" xmlns:wp="http://schemas.openxmlformats.org/drawingml/2006/wordprocessingDrawing" xmlns:w10="urn:schemas-microsoft-com:office:word" xmlns:w="http://schemas.openxmlformats.org/wordprocessingml/2006/main" xmlns:w14="http://schemas.microsoft.com/office/word/2010/wordml" xmlns:w15="http://schemas.microsoft.com/office/word/2012/wordml" xmlns:w16se="http://schemas.microsoft.com/office/word/2015/wordml/symex" xmlns:wpg="http://schemas.microsoft.com/office/word/2010/wordprocessingGroup" xmlns:wpi="http://schemas.microsoft.com/office/word/2010/wordprocessingInk" xmlns:wne="http://schemas.microsoft.com/office/word/2006/wordml" xmlns:wps="http://schemas.microsoft.com/office/word/2010/wordprocessingShape" mc:Ignorable="w14 w15 w16se wp14">
+<w:hdr xmlns:wpc="http://schemas.microsoft.com/office/word/2010/wordprocessingCanvas" xmlns:cx="http://schemas.microsoft.com/office/drawing/2014/chartex" xmlns:cx1="http://schemas.microsoft.com/office/drawing/2015/9/8/chartex" xmlns:cx2="http://schemas.microsoft.com/office/drawing/2015/10/21/chartex" xmlns:cx3="http://schemas.microsoft.com/office/drawing/2016/5/9/chartex" xmlns:cx4="http://schemas.microsoft.com/office/drawing/2016/5/10/chartex" xmlns:cx5="http://schemas.microsoft.com/office/drawing/2016/5/11/chartex" xmlns:cx6="http://schemas.microsoft.com/office/drawing/2016/5/12/chartex" xmlns:cx7="http://schemas.microsoft.com/office/drawing/2016/5/13/chartex" xmlns:cx8="http://schemas.microsoft.com/office/drawing/2016/5/14/chartex" xmlns:mc="http://schemas.openxmlformats.org/markup-compatibility/2006" xmlns:aink="http://schemas.microsoft.com/office/drawing/2016/ink" xmlns:am3d="http://schemas.microsoft.com/office/drawing/2017/model3d" xmlns:o="urn:schemas-microsoft-com:office:office" xmlns:oel="http://schemas.microsoft.com/office/2019/extlst" xmlns:r="http://schemas.openxmlformats.org/officeDocument/2006/relationships" xmlns:m="http://schemas.openxmlformats.org/officeDocument/2006/math" xmlns:v="urn:schemas-microsoft-com:vml" xmlns:wp14="http://schemas.microsoft.com/office/word/2010/wordprocessingDrawing" xmlns:wp="http://schemas.openxmlformats.org/drawingml/2006/wordprocessingDrawing" xmlns:w10="urn:schemas-microsoft-com:office:word" xmlns:w="http://schemas.openxmlformats.org/wordprocessingml/2006/main" xmlns:w14="http://schemas.microsoft.com/office/word/2010/wordml" xmlns:w15="http://schemas.microsoft.com/office/word/2012/wordml" xmlns:w16cex="http://schemas.microsoft.com/office/word/2018/wordml/cex" xmlns:w16cid="http://schemas.microsoft.com/office/word/2016/wordml/cid" xmlns:w16="http://schemas.microsoft.com/office/word/2018/wordml" xmlns:w16du="http://schemas.microsoft.com/office/word/2023/wordml/word16du" xmlns:w16sdtdh="http://schemas.microsoft.com/office/word/2020/wordml/sdtdatahash" xmlns:w16sdtfl="http://schemas.microsoft.com/office/word/2024/wordml/sdtformatlock" xmlns:w16se="http://schemas.microsoft.com/office/word/2015/wordml/symex" xmlns:wpg="http://schemas.microsoft.com/office/word/2010/wordprocessingGroup" xmlns:wpi="http://schemas.microsoft.com/office/word/2010/wordprocessingInk" xmlns:wne="http://schemas.microsoft.com/office/word/2006/wordml" xmlns:wps="http://schemas.microsoft.com/office/word/2010/wordprocessingShape" mc:Ignorable="w14 w15 w16se w16cid w16 w16cex w16sdtdh w16sdtfl w16du wp14">
   <w:tbl>
     <w:tblPr>
       <w:tblStyle w:val="Tablaconcuadrcula"/>
@@ -2065,7 +2119,7 @@
 </file>
 
 <file path=word/numbering.xml><?xml version="1.0" encoding="utf-8"?>
-<w:numbering xmlns:wpc="http://schemas.microsoft.com/office/word/2010/wordprocessingCanvas" xmlns:cx="http://schemas.microsoft.com/office/drawing/2014/chartex" xmlns:mc="http://schemas.openxmlformats.org/markup-compatibility/2006" xmlns:o="urn:schemas-microsoft-com:office:office" xmlns:r="http://schemas.openxmlformats.org/officeDocument/2006/relationships" xmlns:m="http://schemas.openxmlformats.org/officeDocument/2006/math" xmlns:v="urn:schemas-microsoft-com:vml" xmlns:wp14="http://schemas.microsoft.com/office/word/2010/wordprocessingDrawing" xmlns:wp="http://schemas.openxmlformats.org/drawingml/2006/wordprocessingDrawing" xmlns:w10="urn:schemas-microsoft-com:office:word" xmlns:w="http://schemas.openxmlformats.org/wordprocessingml/2006/main" xmlns:w14="http://schemas.microsoft.com/office/word/2010/wordml" xmlns:w15="http://schemas.microsoft.com/office/word/2012/wordml" xmlns:w16se="http://schemas.microsoft.com/office/word/2015/wordml/symex" xmlns:wpg="http://schemas.microsoft.com/office/word/2010/wordprocessingGroup" xmlns:wpi="http://schemas.microsoft.com/office/word/2010/wordprocessingInk" xmlns:wne="http://schemas.microsoft.com/office/word/2006/wordml" xmlns:wps="http://schemas.microsoft.com/office/word/2010/wordprocessingShape" mc:Ignorable="w14 w15 w16se wp14">
+<w:numbering xmlns:wpc="http://schemas.microsoft.com/office/word/2010/wordprocessingCanvas" xmlns:cx="http://schemas.microsoft.com/office/drawing/2014/chartex" xmlns:cx1="http://schemas.microsoft.com/office/drawing/2015/9/8/chartex" xmlns:cx2="http://schemas.microsoft.com/office/drawing/2015/10/21/chartex" xmlns:cx3="http://schemas.microsoft.com/office/drawing/2016/5/9/chartex" xmlns:cx4="http://schemas.microsoft.com/office/drawing/2016/5/10/chartex" xmlns:cx5="http://schemas.microsoft.com/office/drawing/2016/5/11/chartex" xmlns:cx6="http://schemas.microsoft.com/office/drawing/2016/5/12/chartex" xmlns:cx7="http://schemas.microsoft.com/office/drawing/2016/5/13/chartex" xmlns:cx8="http://schemas.microsoft.com/office/drawing/2016/5/14/chartex" xmlns:mc="http://schemas.openxmlformats.org/markup-compatibility/2006" xmlns:aink="http://schemas.microsoft.com/office/drawing/2016/ink" xmlns:am3d="http://schemas.microsoft.com/office/drawing/2017/model3d" xmlns:o="urn:schemas-microsoft-com:office:office" xmlns:oel="http://schemas.microsoft.com/office/2019/extlst" xmlns:r="http://schemas.openxmlformats.org/officeDocument/2006/relationships" xmlns:m="http://schemas.openxmlformats.org/officeDocument/2006/math" xmlns:v="urn:schemas-microsoft-com:vml" xmlns:wp14="http://schemas.microsoft.com/office/word/2010/wordprocessingDrawing" xmlns:wp="http://schemas.openxmlformats.org/drawingml/2006/wordprocessingDrawing" xmlns:w10="urn:schemas-microsoft-com:office:word" xmlns:w="http://schemas.openxmlformats.org/wordprocessingml/2006/main" xmlns:w14="http://schemas.microsoft.com/office/word/2010/wordml" xmlns:w15="http://schemas.microsoft.com/office/word/2012/wordml" xmlns:w16cex="http://schemas.microsoft.com/office/word/2018/wordml/cex" xmlns:w16cid="http://schemas.microsoft.com/office/word/2016/wordml/cid" xmlns:w16="http://schemas.microsoft.com/office/word/2018/wordml" xmlns:w16du="http://schemas.microsoft.com/office/word/2023/wordml/word16du" xmlns:w16sdtdh="http://schemas.microsoft.com/office/word/2020/wordml/sdtdatahash" xmlns:w16sdtfl="http://schemas.microsoft.com/office/word/2024/wordml/sdtformatlock" xmlns:w16se="http://schemas.microsoft.com/office/word/2015/wordml/symex" xmlns:wpg="http://schemas.microsoft.com/office/word/2010/wordprocessingGroup" xmlns:wpi="http://schemas.microsoft.com/office/word/2010/wordprocessingInk" xmlns:wne="http://schemas.microsoft.com/office/word/2006/wordml" xmlns:wps="http://schemas.microsoft.com/office/word/2010/wordprocessingShape" mc:Ignorable="w14 w15 w16se w16cid w16 w16cex w16sdtdh w16sdtfl w16du wp14">
   <w:abstractNum w:abstractNumId="0" w15:restartNumberingAfterBreak="0">
     <w:nsid w:val="049156A1"/>
     <w:multiLevelType w:val="hybridMultilevel"/>
@@ -6639,124 +6693,124 @@
       </w:rPr>
     </w:lvl>
   </w:abstractNum>
-  <w:num w:numId="1">
+  <w:num w:numId="1" w16cid:durableId="1374034397">
     <w:abstractNumId w:val="3"/>
   </w:num>
-  <w:num w:numId="2">
+  <w:num w:numId="2" w16cid:durableId="1337877241">
     <w:abstractNumId w:val="8"/>
   </w:num>
-  <w:num w:numId="3">
+  <w:num w:numId="3" w16cid:durableId="1228682351">
     <w:abstractNumId w:val="12"/>
   </w:num>
-  <w:num w:numId="4">
+  <w:num w:numId="4" w16cid:durableId="882980045">
     <w:abstractNumId w:val="28"/>
   </w:num>
-  <w:num w:numId="5">
+  <w:num w:numId="5" w16cid:durableId="2010939123">
     <w:abstractNumId w:val="30"/>
   </w:num>
-  <w:num w:numId="6">
+  <w:num w:numId="6" w16cid:durableId="2124885488">
     <w:abstractNumId w:val="4"/>
   </w:num>
-  <w:num w:numId="7">
+  <w:num w:numId="7" w16cid:durableId="1500462309">
     <w:abstractNumId w:val="11"/>
   </w:num>
-  <w:num w:numId="8">
+  <w:num w:numId="8" w16cid:durableId="1100416573">
     <w:abstractNumId w:val="19"/>
   </w:num>
-  <w:num w:numId="9">
+  <w:num w:numId="9" w16cid:durableId="312609727">
     <w:abstractNumId w:val="15"/>
   </w:num>
-  <w:num w:numId="10">
+  <w:num w:numId="10" w16cid:durableId="369230505">
     <w:abstractNumId w:val="9"/>
   </w:num>
-  <w:num w:numId="11">
+  <w:num w:numId="11" w16cid:durableId="2084446006">
     <w:abstractNumId w:val="24"/>
   </w:num>
-  <w:num w:numId="12">
+  <w:num w:numId="12" w16cid:durableId="52628698">
     <w:abstractNumId w:val="35"/>
   </w:num>
-  <w:num w:numId="13">
+  <w:num w:numId="13" w16cid:durableId="1246451384">
     <w:abstractNumId w:val="29"/>
   </w:num>
-  <w:num w:numId="14">
+  <w:num w:numId="14" w16cid:durableId="1653291974">
     <w:abstractNumId w:val="1"/>
   </w:num>
-  <w:num w:numId="15">
+  <w:num w:numId="15" w16cid:durableId="313721807">
     <w:abstractNumId w:val="36"/>
   </w:num>
-  <w:num w:numId="16">
+  <w:num w:numId="16" w16cid:durableId="1930773683">
     <w:abstractNumId w:val="21"/>
   </w:num>
-  <w:num w:numId="17">
+  <w:num w:numId="17" w16cid:durableId="720204523">
     <w:abstractNumId w:val="17"/>
   </w:num>
-  <w:num w:numId="18">
+  <w:num w:numId="18" w16cid:durableId="1223717015">
     <w:abstractNumId w:val="31"/>
   </w:num>
-  <w:num w:numId="19">
+  <w:num w:numId="19" w16cid:durableId="1838838074">
     <w:abstractNumId w:val="10"/>
   </w:num>
-  <w:num w:numId="20">
+  <w:num w:numId="20" w16cid:durableId="661663919">
     <w:abstractNumId w:val="39"/>
   </w:num>
-  <w:num w:numId="21">
+  <w:num w:numId="21" w16cid:durableId="563495200">
     <w:abstractNumId w:val="34"/>
   </w:num>
-  <w:num w:numId="22">
+  <w:num w:numId="22" w16cid:durableId="1855001288">
     <w:abstractNumId w:val="13"/>
   </w:num>
-  <w:num w:numId="23">
+  <w:num w:numId="23" w16cid:durableId="1696926267">
     <w:abstractNumId w:val="14"/>
   </w:num>
-  <w:num w:numId="24">
+  <w:num w:numId="24" w16cid:durableId="427310889">
     <w:abstractNumId w:val="5"/>
   </w:num>
-  <w:num w:numId="25">
+  <w:num w:numId="25" w16cid:durableId="37166848">
     <w:abstractNumId w:val="16"/>
   </w:num>
-  <w:num w:numId="26">
+  <w:num w:numId="26" w16cid:durableId="29038101">
     <w:abstractNumId w:val="20"/>
   </w:num>
-  <w:num w:numId="27">
+  <w:num w:numId="27" w16cid:durableId="399137328">
     <w:abstractNumId w:val="23"/>
   </w:num>
-  <w:num w:numId="28">
+  <w:num w:numId="28" w16cid:durableId="1256741074">
     <w:abstractNumId w:val="0"/>
   </w:num>
-  <w:num w:numId="29">
+  <w:num w:numId="29" w16cid:durableId="325207199">
     <w:abstractNumId w:val="18"/>
   </w:num>
-  <w:num w:numId="30">
+  <w:num w:numId="30" w16cid:durableId="1440956486">
     <w:abstractNumId w:val="22"/>
   </w:num>
-  <w:num w:numId="31">
+  <w:num w:numId="31" w16cid:durableId="1860509478">
     <w:abstractNumId w:val="2"/>
   </w:num>
-  <w:num w:numId="32">
+  <w:num w:numId="32" w16cid:durableId="1852447388">
     <w:abstractNumId w:val="7"/>
   </w:num>
-  <w:num w:numId="33">
+  <w:num w:numId="33" w16cid:durableId="225192916">
     <w:abstractNumId w:val="32"/>
   </w:num>
-  <w:num w:numId="34">
+  <w:num w:numId="34" w16cid:durableId="930240135">
     <w:abstractNumId w:val="38"/>
   </w:num>
-  <w:num w:numId="35">
+  <w:num w:numId="35" w16cid:durableId="2008903870">
     <w:abstractNumId w:val="6"/>
   </w:num>
-  <w:num w:numId="36">
+  <w:num w:numId="36" w16cid:durableId="1807233944">
     <w:abstractNumId w:val="25"/>
   </w:num>
-  <w:num w:numId="37">
+  <w:num w:numId="37" w16cid:durableId="1599410106">
     <w:abstractNumId w:val="37"/>
   </w:num>
-  <w:num w:numId="38">
+  <w:num w:numId="38" w16cid:durableId="28534725">
     <w:abstractNumId w:val="27"/>
   </w:num>
-  <w:num w:numId="39">
+  <w:num w:numId="39" w16cid:durableId="1541014639">
     <w:abstractNumId w:val="26"/>
   </w:num>
-  <w:num w:numId="40">
+  <w:num w:numId="40" w16cid:durableId="1233194770">
     <w:abstractNumId w:val="33"/>
   </w:num>
   <w:numIdMacAtCleanup w:val="18"/>
@@ -6764,7 +6818,7 @@
 </file>
 
 <file path=word/styles.xml><?xml version="1.0" encoding="utf-8"?>
-<w:styles xmlns:mc="http://schemas.openxmlformats.org/markup-compatibility/2006" xmlns:r="http://schemas.openxmlformats.org/officeDocument/2006/relationships" xmlns:w="http://schemas.openxmlformats.org/wordprocessingml/2006/main" xmlns:w14="http://schemas.microsoft.com/office/word/2010/wordml" xmlns:w15="http://schemas.microsoft.com/office/word/2012/wordml" xmlns:w16se="http://schemas.microsoft.com/office/word/2015/wordml/symex" mc:Ignorable="w14 w15 w16se">
+<w:styles xmlns:mc="http://schemas.openxmlformats.org/markup-compatibility/2006" xmlns:r="http://schemas.openxmlformats.org/officeDocument/2006/relationships" xmlns:w="http://schemas.openxmlformats.org/wordprocessingml/2006/main" xmlns:w14="http://schemas.microsoft.com/office/word/2010/wordml" xmlns:w15="http://schemas.microsoft.com/office/word/2012/wordml" xmlns:w16cex="http://schemas.microsoft.com/office/word/2018/wordml/cex" xmlns:w16cid="http://schemas.microsoft.com/office/word/2016/wordml/cid" xmlns:w16="http://schemas.microsoft.com/office/word/2018/wordml" xmlns:w16du="http://schemas.microsoft.com/office/word/2023/wordml/word16du" xmlns:w16sdtdh="http://schemas.microsoft.com/office/word/2020/wordml/sdtdatahash" xmlns:w16sdtfl="http://schemas.microsoft.com/office/word/2024/wordml/sdtformatlock" xmlns:w16se="http://schemas.microsoft.com/office/word/2015/wordml/symex" mc:Ignorable="w14 w15 w16se w16cid w16 w16cex w16sdtdh w16sdtfl w16du">
   <w:docDefaults>
     <w:rPrDefault>
       <w:rPr>
@@ -6780,7 +6834,7 @@
       </w:pPr>
     </w:pPrDefault>
   </w:docDefaults>
-  <w:latentStyles w:defLockedState="0" w:defUIPriority="99" w:defSemiHidden="0" w:defUnhideWhenUsed="0" w:defQFormat="0" w:count="371">
+  <w:latentStyles w:defLockedState="0" w:defUIPriority="99" w:defSemiHidden="0" w:defUnhideWhenUsed="0" w:defQFormat="0" w:count="376">
     <w:lsdException w:name="Normal" w:uiPriority="0" w:qFormat="1"/>
     <w:lsdException w:name="heading 1" w:uiPriority="9" w:qFormat="1"/>
     <w:lsdException w:name="heading 2" w:semiHidden="1" w:uiPriority="9" w:unhideWhenUsed="1" w:qFormat="1"/>
@@ -7152,6 +7206,11 @@
     <w:lsdException w:name="List Table 5 Dark Accent 6" w:uiPriority="50"/>
     <w:lsdException w:name="List Table 6 Colorful Accent 6" w:uiPriority="51"/>
     <w:lsdException w:name="List Table 7 Colorful Accent 6" w:uiPriority="52"/>
+    <w:lsdException w:name="Mention" w:semiHidden="1" w:unhideWhenUsed="1"/>
+    <w:lsdException w:name="Smart Hyperlink" w:semiHidden="1" w:unhideWhenUsed="1"/>
+    <w:lsdException w:name="Hashtag" w:semiHidden="1" w:unhideWhenUsed="1"/>
+    <w:lsdException w:name="Unresolved Mention" w:semiHidden="1" w:unhideWhenUsed="1"/>
+    <w:lsdException w:name="Smart Link" w:semiHidden="1" w:unhideWhenUsed="1"/>
   </w:latentStyles>
   <w:style w:type="paragraph" w:default="1" w:styleId="Normal">
     <w:name w:val="Normal"/>
@@ -7225,7 +7284,6 @@
   <w:style w:type="character" w:default="1" w:styleId="Fuentedeprrafopredeter">
     <w:name w:val="Default Paragraph Font"/>
     <w:uiPriority w:val="1"/>
-    <w:semiHidden/>
     <w:unhideWhenUsed/>
   </w:style>
   <w:style w:type="table" w:default="1" w:styleId="Tablanormal">
@@ -8135,7 +8193,7 @@
       <w:szCs w:val="24"/>
     </w:rPr>
   </w:style>
-  <w:style w:type="table" w:styleId="Cuadrculadetablaclara">
+  <w:style w:type="table" w:styleId="Tablaconcuadrculaclara">
     <w:name w:val="Grid Table Light"/>
     <w:basedOn w:val="Tablanormal"/>
     <w:uiPriority w:val="40"/>
@@ -8157,7 +8215,7 @@
   <w:style w:type="table" w:customStyle="1" w:styleId="Cuadrculadetablaclara1">
     <w:name w:val="Cuadrícula de tabla clara1"/>
     <w:basedOn w:val="Tablanormal"/>
-    <w:next w:val="Cuadrculadetablaclara"/>
+    <w:next w:val="Tablaconcuadrculaclara"/>
     <w:uiPriority w:val="40"/>
     <w:rsid w:val="00943DF1"/>
     <w:pPr>
@@ -8210,532 +8268,6 @@
     </w:rPr>
   </w:style>
 </w:styles>
-</file>
-
-<file path=word/glossary/document.xml><?xml version="1.0" encoding="utf-8"?>
-<w:glossaryDocument xmlns:wpc="http://schemas.microsoft.com/office/word/2010/wordprocessingCanvas" xmlns:cx="http://schemas.microsoft.com/office/drawing/2014/chartex" xmlns:mc="http://schemas.openxmlformats.org/markup-compatibility/2006" xmlns:o="urn:schemas-microsoft-com:office:office" xmlns:r="http://schemas.openxmlformats.org/officeDocument/2006/relationships" xmlns:m="http://schemas.openxmlformats.org/officeDocument/2006/math" xmlns:v="urn:schemas-microsoft-com:vml" xmlns:wp14="http://schemas.microsoft.com/office/word/2010/wordprocessingDrawing" xmlns:wp="http://schemas.openxmlformats.org/drawingml/2006/wordprocessingDrawing" xmlns:w10="urn:schemas-microsoft-com:office:word" xmlns:w="http://schemas.openxmlformats.org/wordprocessingml/2006/main" xmlns:w14="http://schemas.microsoft.com/office/word/2010/wordml" xmlns:w15="http://schemas.microsoft.com/office/word/2012/wordml" xmlns:w16se="http://schemas.microsoft.com/office/word/2015/wordml/symex" xmlns:wpg="http://schemas.microsoft.com/office/word/2010/wordprocessingGroup" xmlns:wpi="http://schemas.microsoft.com/office/word/2010/wordprocessingInk" xmlns:wne="http://schemas.microsoft.com/office/word/2006/wordml" xmlns:wps="http://schemas.microsoft.com/office/word/2010/wordprocessingShape" mc:Ignorable="w14 w15 w16se wp14"/>
-</file>
-
-<file path=word/glossary/fontTable.xml><?xml version="1.0" encoding="utf-8"?>
-<w:fonts xmlns:mc="http://schemas.openxmlformats.org/markup-compatibility/2006" xmlns:r="http://schemas.openxmlformats.org/officeDocument/2006/relationships" xmlns:w="http://schemas.openxmlformats.org/wordprocessingml/2006/main" xmlns:w14="http://schemas.microsoft.com/office/word/2010/wordml" xmlns:w15="http://schemas.microsoft.com/office/word/2012/wordml" xmlns:w16se="http://schemas.microsoft.com/office/word/2015/wordml/symex" mc:Ignorable="w14 w15 w16se">
-  <w:font w:name="Calibri">
-    <w:panose1 w:val="020F0502020204030204"/>
-    <w:charset w:val="00"/>
-    <w:family w:val="swiss"/>
-    <w:pitch w:val="variable"/>
-    <w:sig w:usb0="E4002EFF" w:usb1="C000247B" w:usb2="00000009" w:usb3="00000000" w:csb0="000001FF" w:csb1="00000000"/>
-  </w:font>
-  <w:font w:name="Times New Roman">
-    <w:panose1 w:val="02020603050405020304"/>
-    <w:charset w:val="00"/>
-    <w:family w:val="roman"/>
-    <w:pitch w:val="variable"/>
-    <w:sig w:usb0="E0002EFF" w:usb1="C000785B" w:usb2="00000009" w:usb3="00000000" w:csb0="000001FF" w:csb1="00000000"/>
-  </w:font>
-  <w:font w:name="Courier New">
-    <w:panose1 w:val="02070309020205020404"/>
-    <w:charset w:val="00"/>
-    <w:family w:val="modern"/>
-    <w:pitch w:val="fixed"/>
-    <w:sig w:usb0="E0002EFF" w:usb1="C0007843" w:usb2="00000009" w:usb3="00000000" w:csb0="000001FF" w:csb1="00000000"/>
-  </w:font>
-  <w:font w:name="Wingdings">
-    <w:panose1 w:val="05000000000000000000"/>
-    <w:charset w:val="02"/>
-    <w:family w:val="auto"/>
-    <w:pitch w:val="variable"/>
-    <w:sig w:usb0="00000000" w:usb1="10000000" w:usb2="00000000" w:usb3="00000000" w:csb0="80000000" w:csb1="00000000"/>
-  </w:font>
-  <w:font w:name="Symbol">
-    <w:panose1 w:val="05050102010706020507"/>
-    <w:charset w:val="02"/>
-    <w:family w:val="roman"/>
-    <w:pitch w:val="variable"/>
-    <w:sig w:usb0="00000000" w:usb1="10000000" w:usb2="00000000" w:usb3="00000000" w:csb0="80000000" w:csb1="00000000"/>
-  </w:font>
-  <w:font w:name="Calibri Light">
-    <w:panose1 w:val="020F0302020204030204"/>
-    <w:charset w:val="00"/>
-    <w:family w:val="swiss"/>
-    <w:pitch w:val="variable"/>
-    <w:sig w:usb0="E4002EFF" w:usb1="C000247B" w:usb2="00000009" w:usb3="00000000" w:csb0="000001FF" w:csb1="00000000"/>
-  </w:font>
-  <w:font w:name="Segoe UI">
-    <w:panose1 w:val="020B0502040204020203"/>
-    <w:charset w:val="00"/>
-    <w:family w:val="swiss"/>
-    <w:pitch w:val="variable"/>
-    <w:sig w:usb0="E4002EFF" w:usb1="C000E47F" w:usb2="00000009" w:usb3="00000000" w:csb0="000001FF" w:csb1="00000000"/>
-  </w:font>
-  <w:font w:name="Century Gothic">
-    <w:panose1 w:val="020B0502020202020204"/>
-    <w:charset w:val="00"/>
-    <w:family w:val="swiss"/>
-    <w:pitch w:val="variable"/>
-    <w:sig w:usb0="00000287" w:usb1="00000000" w:usb2="00000000" w:usb3="00000000" w:csb0="0000009F" w:csb1="00000000"/>
-  </w:font>
-</w:fonts>
-</file>
-
-<file path=word/glossary/settings.xml><?xml version="1.0" encoding="utf-8"?>
-<w:settings xmlns:mc="http://schemas.openxmlformats.org/markup-compatibility/2006" xmlns:o="urn:schemas-microsoft-com:office:office" xmlns:r="http://schemas.openxmlformats.org/officeDocument/2006/relationships" xmlns:m="http://schemas.openxmlformats.org/officeDocument/2006/math" xmlns:v="urn:schemas-microsoft-com:vml" xmlns:w10="urn:schemas-microsoft-com:office:word" xmlns:w="http://schemas.openxmlformats.org/wordprocessingml/2006/main" xmlns:w14="http://schemas.microsoft.com/office/word/2010/wordml" xmlns:w15="http://schemas.microsoft.com/office/word/2012/wordml" xmlns:w16se="http://schemas.microsoft.com/office/word/2015/wordml/symex" xmlns:sl="http://schemas.openxmlformats.org/schemaLibrary/2006/main" mc:Ignorable="w14 w15 w16se">
-  <w:defaultTabStop w:val="708"/>
-  <w:hyphenationZone w:val="425"/>
-  <w:characterSpacingControl w:val="doNotCompress"/>
-  <w:compat>
-    <w:useFELayout/>
-    <w:compatSetting w:name="compatibilityMode" w:uri="http://schemas.microsoft.com/office/word" w:val="12"/>
-  </w:compat>
-  <w:rsids>
-    <w:rsidRoot w:val="008F14D6"/>
-    <w:rsid w:val="008F14D6"/>
-  </w:rsids>
-  <m:mathPr>
-    <m:mathFont m:val="Cambria Math"/>
-    <m:brkBin m:val="before"/>
-    <m:brkBinSub m:val="--"/>
-    <m:smallFrac m:val="0"/>
-    <m:dispDef/>
-    <m:lMargin m:val="0"/>
-    <m:rMargin m:val="0"/>
-    <m:defJc m:val="centerGroup"/>
-    <m:wrapIndent m:val="1440"/>
-    <m:intLim m:val="subSup"/>
-    <m:naryLim m:val="undOvr"/>
-  </m:mathPr>
-  <w:themeFontLang w:val="es-CL"/>
-  <w:clrSchemeMapping w:bg1="light1" w:t1="dark1" w:bg2="light2" w:t2="dark2" w:accent1="accent1" w:accent2="accent2" w:accent3="accent3" w:accent4="accent4" w:accent5="accent5" w:accent6="accent6" w:hyperlink="hyperlink" w:followedHyperlink="followedHyperlink"/>
-  <w:decimalSymbol w:val=","/>
-  <w:listSeparator w:val=";"/>
-</w:settings>
-</file>
-
-<file path=word/glossary/styles.xml><?xml version="1.0" encoding="utf-8"?>
-<w:styles xmlns:mc="http://schemas.openxmlformats.org/markup-compatibility/2006" xmlns:r="http://schemas.openxmlformats.org/officeDocument/2006/relationships" xmlns:w="http://schemas.openxmlformats.org/wordprocessingml/2006/main" xmlns:w14="http://schemas.microsoft.com/office/word/2010/wordml" xmlns:w15="http://schemas.microsoft.com/office/word/2012/wordml" xmlns:w16se="http://schemas.microsoft.com/office/word/2015/wordml/symex" mc:Ignorable="w14 w15 w16se">
-  <w:docDefaults>
-    <w:rPrDefault>
-      <w:rPr>
-        <w:rFonts w:asciiTheme="minorHAnsi" w:eastAsiaTheme="minorEastAsia" w:hAnsiTheme="minorHAnsi" w:cstheme="minorBidi"/>
-        <w:sz w:val="22"/>
-        <w:szCs w:val="22"/>
-        <w:lang w:val="es-CL" w:eastAsia="es-CL" w:bidi="ar-SA"/>
-      </w:rPr>
-    </w:rPrDefault>
-    <w:pPrDefault>
-      <w:pPr>
-        <w:spacing w:after="160" w:line="259" w:lineRule="auto"/>
-      </w:pPr>
-    </w:pPrDefault>
-  </w:docDefaults>
-  <w:latentStyles w:defLockedState="0" w:defUIPriority="99" w:defSemiHidden="0" w:defUnhideWhenUsed="0" w:defQFormat="0" w:count="371">
-    <w:lsdException w:name="Normal" w:uiPriority="0" w:qFormat="1"/>
-    <w:lsdException w:name="heading 1" w:uiPriority="9" w:qFormat="1"/>
-    <w:lsdException w:name="heading 2" w:semiHidden="1" w:uiPriority="9" w:unhideWhenUsed="1" w:qFormat="1"/>
-    <w:lsdException w:name="heading 3" w:semiHidden="1" w:uiPriority="9" w:unhideWhenUsed="1" w:qFormat="1"/>
-    <w:lsdException w:name="heading 4" w:semiHidden="1" w:uiPriority="9" w:unhideWhenUsed="1" w:qFormat="1"/>
-    <w:lsdException w:name="heading 5" w:semiHidden="1" w:uiPriority="9" w:unhideWhenUsed="1" w:qFormat="1"/>
-    <w:lsdException w:name="heading 6" w:semiHidden="1" w:uiPriority="9" w:unhideWhenUsed="1" w:qFormat="1"/>
-    <w:lsdException w:name="heading 7" w:semiHidden="1" w:uiPriority="9" w:unhideWhenUsed="1" w:qFormat="1"/>
-    <w:lsdException w:name="heading 8" w:semiHidden="1" w:uiPriority="9" w:unhideWhenUsed="1" w:qFormat="1"/>
-    <w:lsdException w:name="heading 9" w:semiHidden="1" w:uiPriority="9" w:unhideWhenUsed="1" w:qFormat="1"/>
-    <w:lsdException w:name="index 1" w:semiHidden="1" w:unhideWhenUsed="1"/>
-    <w:lsdException w:name="index 2" w:semiHidden="1" w:unhideWhenUsed="1"/>
-    <w:lsdException w:name="index 3" w:semiHidden="1" w:unhideWhenUsed="1"/>
-    <w:lsdException w:name="index 4" w:semiHidden="1" w:unhideWhenUsed="1"/>
-    <w:lsdException w:name="index 5" w:semiHidden="1" w:unhideWhenUsed="1"/>
-    <w:lsdException w:name="index 6" w:semiHidden="1" w:unhideWhenUsed="1"/>
-    <w:lsdException w:name="index 7" w:semiHidden="1" w:unhideWhenUsed="1"/>
-    <w:lsdException w:name="index 8" w:semiHidden="1" w:unhideWhenUsed="1"/>
-    <w:lsdException w:name="index 9" w:semiHidden="1" w:unhideWhenUsed="1"/>
-    <w:lsdException w:name="toc 1" w:semiHidden="1" w:uiPriority="39" w:unhideWhenUsed="1"/>
-    <w:lsdException w:name="toc 2" w:semiHidden="1" w:uiPriority="39" w:unhideWhenUsed="1"/>
-    <w:lsdException w:name="toc 3" w:semiHidden="1" w:uiPriority="39" w:unhideWhenUsed="1"/>
-    <w:lsdException w:name="toc 4" w:semiHidden="1" w:uiPriority="39" w:unhideWhenUsed="1"/>
-    <w:lsdException w:name="toc 5" w:semiHidden="1" w:uiPriority="39" w:unhideWhenUsed="1"/>
-    <w:lsdException w:name="toc 6" w:semiHidden="1" w:uiPriority="39" w:unhideWhenUsed="1"/>
-    <w:lsdException w:name="toc 7" w:semiHidden="1" w:uiPriority="39" w:unhideWhenUsed="1"/>
-    <w:lsdException w:name="toc 8" w:semiHidden="1" w:uiPriority="39" w:unhideWhenUsed="1"/>
-    <w:lsdException w:name="toc 9" w:semiHidden="1" w:uiPriority="39" w:unhideWhenUsed="1"/>
-    <w:lsdException w:name="Normal Indent" w:semiHidden="1" w:unhideWhenUsed="1"/>
-    <w:lsdException w:name="footnote text" w:semiHidden="1" w:unhideWhenUsed="1"/>
-    <w:lsdException w:name="annotation text" w:semiHidden="1" w:unhideWhenUsed="1"/>
-    <w:lsdException w:name="header" w:semiHidden="1" w:unhideWhenUsed="1"/>
-    <w:lsdException w:name="footer" w:semiHidden="1" w:unhideWhenUsed="1"/>
-    <w:lsdException w:name="index heading" w:semiHidden="1" w:unhideWhenUsed="1"/>
-    <w:lsdException w:name="caption" w:semiHidden="1" w:uiPriority="35" w:unhideWhenUsed="1" w:qFormat="1"/>
-    <w:lsdException w:name="table of figures" w:semiHidden="1" w:unhideWhenUsed="1"/>
-    <w:lsdException w:name="envelope address" w:semiHidden="1" w:unhideWhenUsed="1"/>
-    <w:lsdException w:name="envelope return" w:semiHidden="1" w:unhideWhenUsed="1"/>
-    <w:lsdException w:name="footnote reference" w:semiHidden="1" w:unhideWhenUsed="1"/>
-    <w:lsdException w:name="annotation reference" w:semiHidden="1" w:unhideWhenUsed="1"/>
-    <w:lsdException w:name="line number" w:semiHidden="1" w:unhideWhenUsed="1"/>
-    <w:lsdException w:name="page number" w:semiHidden="1" w:unhideWhenUsed="1"/>
-    <w:lsdException w:name="endnote reference" w:semiHidden="1" w:unhideWhenUsed="1"/>
-    <w:lsdException w:name="endnote text" w:semiHidden="1" w:unhideWhenUsed="1"/>
-    <w:lsdException w:name="table of authorities" w:semiHidden="1" w:unhideWhenUsed="1"/>
-    <w:lsdException w:name="macro" w:semiHidden="1" w:unhideWhenUsed="1"/>
-    <w:lsdException w:name="toa heading" w:semiHidden="1" w:unhideWhenUsed="1"/>
-    <w:lsdException w:name="List" w:semiHidden="1" w:unhideWhenUsed="1"/>
-    <w:lsdException w:name="List Bullet" w:semiHidden="1" w:unhideWhenUsed="1"/>
-    <w:lsdException w:name="List Number" w:semiHidden="1" w:unhideWhenUsed="1"/>
-    <w:lsdException w:name="List 2" w:semiHidden="1" w:unhideWhenUsed="1"/>
-    <w:lsdException w:name="List 3" w:semiHidden="1" w:unhideWhenUsed="1"/>
-    <w:lsdException w:name="List 4" w:semiHidden="1" w:unhideWhenUsed="1"/>
-    <w:lsdException w:name="List 5" w:semiHidden="1" w:unhideWhenUsed="1"/>
-    <w:lsdException w:name="List Bullet 2" w:semiHidden="1" w:unhideWhenUsed="1"/>
-    <w:lsdException w:name="List Bullet 3" w:semiHidden="1" w:unhideWhenUsed="1"/>
-    <w:lsdException w:name="List Bullet 4" w:semiHidden="1" w:unhideWhenUsed="1"/>
-    <w:lsdException w:name="List Bullet 5" w:semiHidden="1" w:unhideWhenUsed="1"/>
-    <w:lsdException w:name="List Number 2" w:semiHidden="1" w:unhideWhenUsed="1"/>
-    <w:lsdException w:name="List Number 3" w:semiHidden="1" w:unhideWhenUsed="1"/>
-    <w:lsdException w:name="List Number 4" w:semiHidden="1" w:unhideWhenUsed="1"/>
-    <w:lsdException w:name="List Number 5" w:semiHidden="1" w:unhideWhenUsed="1"/>
-    <w:lsdException w:name="Title" w:uiPriority="10" w:qFormat="1"/>
-    <w:lsdException w:name="Closing" w:semiHidden="1" w:unhideWhenUsed="1"/>
-    <w:lsdException w:name="Signature" w:semiHidden="1" w:unhideWhenUsed="1"/>
-    <w:lsdException w:name="Default Paragraph Font" w:semiHidden="1" w:uiPriority="1" w:unhideWhenUsed="1"/>
-    <w:lsdException w:name="Body Text" w:semiHidden="1" w:unhideWhenUsed="1"/>
-    <w:lsdException w:name="Body Text Indent" w:semiHidden="1" w:unhideWhenUsed="1"/>
-    <w:lsdException w:name="List Continue" w:semiHidden="1" w:unhideWhenUsed="1"/>
-    <w:lsdException w:name="List Continue 2" w:semiHidden="1" w:unhideWhenUsed="1"/>
-    <w:lsdException w:name="List Continue 3" w:semiHidden="1" w:unhideWhenUsed="1"/>
-    <w:lsdException w:name="List Continue 4" w:semiHidden="1" w:unhideWhenUsed="1"/>
-    <w:lsdException w:name="List Continue 5" w:semiHidden="1" w:unhideWhenUsed="1"/>
-    <w:lsdException w:name="Message Header" w:semiHidden="1" w:unhideWhenUsed="1"/>
-    <w:lsdException w:name="Subtitle" w:uiPriority="11" w:qFormat="1"/>
-    <w:lsdException w:name="Salutation" w:semiHidden="1" w:unhideWhenUsed="1"/>
-    <w:lsdException w:name="Date" w:semiHidden="1" w:unhideWhenUsed="1"/>
-    <w:lsdException w:name="Body Text First Indent" w:semiHidden="1" w:unhideWhenUsed="1"/>
-    <w:lsdException w:name="Body Text First Indent 2" w:semiHidden="1" w:unhideWhenUsed="1"/>
-    <w:lsdException w:name="Note Heading" w:semiHidden="1" w:unhideWhenUsed="1"/>
-    <w:lsdException w:name="Body Text 2" w:semiHidden="1" w:unhideWhenUsed="1"/>
-    <w:lsdException w:name="Body Text 3" w:semiHidden="1" w:unhideWhenUsed="1"/>
-    <w:lsdException w:name="Body Text Indent 2" w:semiHidden="1" w:unhideWhenUsed="1"/>
-    <w:lsdException w:name="Body Text Indent 3" w:semiHidden="1" w:unhideWhenUsed="1"/>
-    <w:lsdException w:name="Block Text" w:semiHidden="1" w:unhideWhenUsed="1"/>
-    <w:lsdException w:name="Hyperlink" w:semiHidden="1" w:unhideWhenUsed="1"/>
-    <w:lsdException w:name="FollowedHyperlink" w:semiHidden="1" w:unhideWhenUsed="1"/>
-    <w:lsdException w:name="Strong" w:uiPriority="22" w:qFormat="1"/>
-    <w:lsdException w:name="Emphasis" w:uiPriority="20" w:qFormat="1"/>
-    <w:lsdException w:name="Document Map" w:semiHidden="1" w:unhideWhenUsed="1"/>
-    <w:lsdException w:name="Plain Text" w:semiHidden="1" w:unhideWhenUsed="1"/>
-    <w:lsdException w:name="E-mail Signature" w:semiHidden="1" w:unhideWhenUsed="1"/>
-    <w:lsdException w:name="HTML Top of Form" w:semiHidden="1" w:unhideWhenUsed="1"/>
-    <w:lsdException w:name="HTML Bottom of Form" w:semiHidden="1" w:unhideWhenUsed="1"/>
-    <w:lsdException w:name="Normal (Web)" w:semiHidden="1" w:unhideWhenUsed="1"/>
-    <w:lsdException w:name="HTML Acronym" w:semiHidden="1" w:unhideWhenUsed="1"/>
-    <w:lsdException w:name="HTML Address" w:semiHidden="1" w:unhideWhenUsed="1"/>
-    <w:lsdException w:name="HTML Cite" w:semiHidden="1" w:unhideWhenUsed="1"/>
-    <w:lsdException w:name="HTML Code" w:semiHidden="1" w:unhideWhenUsed="1"/>
-    <w:lsdException w:name="HTML Definition" w:semiHidden="1" w:unhideWhenUsed="1"/>
-    <w:lsdException w:name="HTML Keyboard" w:semiHidden="1" w:unhideWhenUsed="1"/>
-    <w:lsdException w:name="HTML Preformatted" w:semiHidden="1" w:unhideWhenUsed="1"/>
-    <w:lsdException w:name="HTML Sample" w:semiHidden="1" w:unhideWhenUsed="1"/>
-    <w:lsdException w:name="HTML Typewriter" w:semiHidden="1" w:unhideWhenUsed="1"/>
-    <w:lsdException w:name="HTML Variable" w:semiHidden="1" w:unhideWhenUsed="1"/>
-    <w:lsdException w:name="Normal Table" w:semiHidden="1" w:unhideWhenUsed="1"/>
-    <w:lsdException w:name="annotation subject" w:semiHidden="1" w:unhideWhenUsed="1"/>
-    <w:lsdException w:name="No List" w:semiHidden="1" w:unhideWhenUsed="1"/>
-    <w:lsdException w:name="Outline List 1" w:semiHidden="1" w:unhideWhenUsed="1"/>
-    <w:lsdException w:name="Outline List 2" w:semiHidden="1" w:unhideWhenUsed="1"/>
-    <w:lsdException w:name="Outline List 3" w:semiHidden="1" w:unhideWhenUsed="1"/>
-    <w:lsdException w:name="Table Simple 1" w:semiHidden="1" w:unhideWhenUsed="1"/>
-    <w:lsdException w:name="Table Simple 2" w:semiHidden="1" w:unhideWhenUsed="1"/>
-    <w:lsdException w:name="Table Simple 3" w:semiHidden="1" w:unhideWhenUsed="1"/>
-    <w:lsdException w:name="Table Classic 1" w:semiHidden="1" w:unhideWhenUsed="1"/>
-    <w:lsdException w:name="Table Classic 2" w:semiHidden="1" w:unhideWhenUsed="1"/>
-    <w:lsdException w:name="Table Classic 3" w:semiHidden="1" w:unhideWhenUsed="1"/>
-    <w:lsdException w:name="Table Classic 4" w:semiHidden="1" w:unhideWhenUsed="1"/>
-    <w:lsdException w:name="Table Colorful 1" w:semiHidden="1" w:unhideWhenUsed="1"/>
-    <w:lsdException w:name="Table Colorful 2" w:semiHidden="1" w:unhideWhenUsed="1"/>
-    <w:lsdException w:name="Table Colorful 3" w:semiHidden="1" w:unhideWhenUsed="1"/>
-    <w:lsdException w:name="Table Columns 1" w:semiHidden="1" w:unhideWhenUsed="1"/>
-    <w:lsdException w:name="Table Columns 2" w:semiHidden="1" w:unhideWhenUsed="1"/>
-    <w:lsdException w:name="Table Columns 3" w:semiHidden="1" w:unhideWhenUsed="1"/>
-    <w:lsdException w:name="Table Columns 4" w:semiHidden="1" w:unhideWhenUsed="1"/>
-    <w:lsdException w:name="Table Columns 5" w:semiHidden="1" w:unhideWhenUsed="1"/>
-    <w:lsdException w:name="Table Grid 1" w:semiHidden="1" w:unhideWhenUsed="1"/>
-    <w:lsdException w:name="Table Grid 2" w:semiHidden="1" w:unhideWhenUsed="1"/>
-    <w:lsdException w:name="Table Grid 3" w:semiHidden="1" w:unhideWhenUsed="1"/>
-    <w:lsdException w:name="Table Grid 4" w:semiHidden="1" w:unhideWhenUsed="1"/>
-    <w:lsdException w:name="Table Grid 5" w:semiHidden="1" w:unhideWhenUsed="1"/>
-    <w:lsdException w:name="Table Grid 6" w:semiHidden="1" w:unhideWhenUsed="1"/>
-    <w:lsdException w:name="Table Grid 7" w:semiHidden="1" w:unhideWhenUsed="1"/>
-    <w:lsdException w:name="Table Grid 8" w:semiHidden="1" w:unhideWhenUsed="1"/>
-    <w:lsdException w:name="Table List 1" w:semiHidden="1" w:unhideWhenUsed="1"/>
-    <w:lsdException w:name="Table List 2" w:semiHidden="1" w:unhideWhenUsed="1"/>
-    <w:lsdException w:name="Table List 3" w:semiHidden="1" w:unhideWhenUsed="1"/>
-    <w:lsdException w:name="Table List 4" w:semiHidden="1" w:unhideWhenUsed="1"/>
-    <w:lsdException w:name="Table List 5" w:semiHidden="1" w:unhideWhenUsed="1"/>
-    <w:lsdException w:name="Table List 6" w:semiHidden="1" w:unhideWhenUsed="1"/>
-    <w:lsdException w:name="Table List 7" w:semiHidden="1" w:unhideWhenUsed="1"/>
-    <w:lsdException w:name="Table List 8" w:semiHidden="1" w:unhideWhenUsed="1"/>
-    <w:lsdException w:name="Table 3D effects 1" w:semiHidden="1" w:unhideWhenUsed="1"/>
-    <w:lsdException w:name="Table 3D effects 2" w:semiHidden="1" w:unhideWhenUsed="1"/>
-    <w:lsdException w:name="Table 3D effects 3" w:semiHidden="1" w:unhideWhenUsed="1"/>
-    <w:lsdException w:name="Table Contemporary" w:semiHidden="1" w:unhideWhenUsed="1"/>
-    <w:lsdException w:name="Table Elegant" w:semiHidden="1" w:unhideWhenUsed="1"/>
-    <w:lsdException w:name="Table Professional" w:semiHidden="1" w:unhideWhenUsed="1"/>
-    <w:lsdException w:name="Table Subtle 1" w:semiHidden="1" w:unhideWhenUsed="1"/>
-    <w:lsdException w:name="Table Subtle 2" w:semiHidden="1" w:unhideWhenUsed="1"/>
-    <w:lsdException w:name="Table Web 1" w:semiHidden="1" w:unhideWhenUsed="1"/>
-    <w:lsdException w:name="Table Web 2" w:semiHidden="1" w:unhideWhenUsed="1"/>
-    <w:lsdException w:name="Table Web 3" w:semiHidden="1" w:unhideWhenUsed="1"/>
-    <w:lsdException w:name="Balloon Text" w:semiHidden="1" w:unhideWhenUsed="1"/>
-    <w:lsdException w:name="Table Grid" w:uiPriority="39"/>
-    <w:lsdException w:name="Table Theme" w:semiHidden="1" w:unhideWhenUsed="1"/>
-    <w:lsdException w:name="Placeholder Text" w:semiHidden="1"/>
-    <w:lsdException w:name="No Spacing" w:uiPriority="1" w:qFormat="1"/>
-    <w:lsdException w:name="Light Shading" w:uiPriority="60"/>
-    <w:lsdException w:name="Light List" w:uiPriority="61"/>
-    <w:lsdException w:name="Light Grid" w:uiPriority="62"/>
-    <w:lsdException w:name="Medium Shading 1" w:uiPriority="63"/>
-    <w:lsdException w:name="Medium Shading 2" w:uiPriority="64"/>
-    <w:lsdException w:name="Medium List 1" w:uiPriority="65"/>
-    <w:lsdException w:name="Medium List 2" w:uiPriority="66"/>
-    <w:lsdException w:name="Medium Grid 1" w:uiPriority="67"/>
-    <w:lsdException w:name="Medium Grid 2" w:uiPriority="68"/>
-    <w:lsdException w:name="Medium Grid 3" w:uiPriority="69"/>
-    <w:lsdException w:name="Dark List" w:uiPriority="70"/>
-    <w:lsdException w:name="Colorful Shading" w:uiPriority="71"/>
-    <w:lsdException w:name="Colorful List" w:uiPriority="72"/>
-    <w:lsdException w:name="Colorful Grid" w:uiPriority="73"/>
-    <w:lsdException w:name="Light Shading Accent 1" w:uiPriority="60"/>
-    <w:lsdException w:name="Light List Accent 1" w:uiPriority="61"/>
-    <w:lsdException w:name="Light Grid Accent 1" w:uiPriority="62"/>
-    <w:lsdException w:name="Medium Shading 1 Accent 1" w:uiPriority="63"/>
-    <w:lsdException w:name="Medium Shading 2 Accent 1" w:uiPriority="64"/>
-    <w:lsdException w:name="Medium List 1 Accent 1" w:uiPriority="65"/>
-    <w:lsdException w:name="Revision" w:semiHidden="1"/>
-    <w:lsdException w:name="List Paragraph" w:uiPriority="34" w:qFormat="1"/>
-    <w:lsdException w:name="Quote" w:uiPriority="29" w:qFormat="1"/>
-    <w:lsdException w:name="Intense Quote" w:uiPriority="30" w:qFormat="1"/>
-    <w:lsdException w:name="Medium List 2 Accent 1" w:uiPriority="66"/>
-    <w:lsdException w:name="Medium Grid 1 Accent 1" w:uiPriority="67"/>
-    <w:lsdException w:name="Medium Grid 2 Accent 1" w:uiPriority="68"/>
-    <w:lsdException w:name="Medium Grid 3 Accent 1" w:uiPriority="69"/>
-    <w:lsdException w:name="Dark List Accent 1" w:uiPriority="70"/>
-    <w:lsdException w:name="Colorful Shading Accent 1" w:uiPriority="71"/>
-    <w:lsdException w:name="Colorful List Accent 1" w:uiPriority="72"/>
-    <w:lsdException w:name="Colorful Grid Accent 1" w:uiPriority="73"/>
-    <w:lsdException w:name="Light Shading Accent 2" w:uiPriority="60"/>
-    <w:lsdException w:name="Light List Accent 2" w:uiPriority="61"/>
-    <w:lsdException w:name="Light Grid Accent 2" w:uiPriority="62"/>
-    <w:lsdException w:name="Medium Shading 1 Accent 2" w:uiPriority="63"/>
-    <w:lsdException w:name="Medium Shading 2 Accent 2" w:uiPriority="64"/>
-    <w:lsdException w:name="Medium List 1 Accent 2" w:uiPriority="65"/>
-    <w:lsdException w:name="Medium List 2 Accent 2" w:uiPriority="66"/>
-    <w:lsdException w:name="Medium Grid 1 Accent 2" w:uiPriority="67"/>
-    <w:lsdException w:name="Medium Grid 2 Accent 2" w:uiPriority="68"/>
-    <w:lsdException w:name="Medium Grid 3 Accent 2" w:uiPriority="69"/>
-    <w:lsdException w:name="Dark List Accent 2" w:uiPriority="70"/>
-    <w:lsdException w:name="Colorful Shading Accent 2" w:uiPriority="71"/>
-    <w:lsdException w:name="Colorful List Accent 2" w:uiPriority="72"/>
-    <w:lsdException w:name="Colorful Grid Accent 2" w:uiPriority="73"/>
-    <w:lsdException w:name="Light Shading Accent 3" w:uiPriority="60"/>
-    <w:lsdException w:name="Light List Accent 3" w:uiPriority="61"/>
-    <w:lsdException w:name="Light Grid Accent 3" w:uiPriority="62"/>
-    <w:lsdException w:name="Medium Shading 1 Accent 3" w:uiPriority="63"/>
-    <w:lsdException w:name="Medium Shading 2 Accent 3" w:uiPriority="64"/>
-    <w:lsdException w:name="Medium List 1 Accent 3" w:uiPriority="65"/>
-    <w:lsdException w:name="Medium List 2 Accent 3" w:uiPriority="66"/>
-    <w:lsdException w:name="Medium Grid 1 Accent 3" w:uiPriority="67"/>
-    <w:lsdException w:name="Medium Grid 2 Accent 3" w:uiPriority="68"/>
-    <w:lsdException w:name="Medium Grid 3 Accent 3" w:uiPriority="69"/>
-    <w:lsdException w:name="Dark List Accent 3" w:uiPriority="70"/>
-    <w:lsdException w:name="Colorful Shading Accent 3" w:uiPriority="71"/>
-    <w:lsdException w:name="Colorful List Accent 3" w:uiPriority="72"/>
-    <w:lsdException w:name="Colorful Grid Accent 3" w:uiPriority="73"/>
-    <w:lsdException w:name="Light Shading Accent 4" w:uiPriority="60"/>
-    <w:lsdException w:name="Light List Accent 4" w:uiPriority="61"/>
-    <w:lsdException w:name="Light Grid Accent 4" w:uiPriority="62"/>
-    <w:lsdException w:name="Medium Shading 1 Accent 4" w:uiPriority="63"/>
-    <w:lsdException w:name="Medium Shading 2 Accent 4" w:uiPriority="64"/>
-    <w:lsdException w:name="Medium List 1 Accent 4" w:uiPriority="65"/>
-    <w:lsdException w:name="Medium List 2 Accent 4" w:uiPriority="66"/>
-    <w:lsdException w:name="Medium Grid 1 Accent 4" w:uiPriority="67"/>
-    <w:lsdException w:name="Medium Grid 2 Accent 4" w:uiPriority="68"/>
-    <w:lsdException w:name="Medium Grid 3 Accent 4" w:uiPriority="69"/>
-    <w:lsdException w:name="Dark List Accent 4" w:uiPriority="70"/>
-    <w:lsdException w:name="Colorful Shading Accent 4" w:uiPriority="71"/>
-    <w:lsdException w:name="Colorful List Accent 4" w:uiPriority="72"/>
-    <w:lsdException w:name="Colorful Grid Accent 4" w:uiPriority="73"/>
-    <w:lsdException w:name="Light Shading Accent 5" w:uiPriority="60"/>
-    <w:lsdException w:name="Light List Accent 5" w:uiPriority="61"/>
-    <w:lsdException w:name="Light Grid Accent 5" w:uiPriority="62"/>
-    <w:lsdException w:name="Medium Shading 1 Accent 5" w:uiPriority="63"/>
-    <w:lsdException w:name="Medium Shading 2 Accent 5" w:uiPriority="64"/>
-    <w:lsdException w:name="Medium List 1 Accent 5" w:uiPriority="65"/>
-    <w:lsdException w:name="Medium List 2 Accent 5" w:uiPriority="66"/>
-    <w:lsdException w:name="Medium Grid 1 Accent 5" w:uiPriority="67"/>
-    <w:lsdException w:name="Medium Grid 2 Accent 5" w:uiPriority="68"/>
-    <w:lsdException w:name="Medium Grid 3 Accent 5" w:uiPriority="69"/>
-    <w:lsdException w:name="Dark List Accent 5" w:uiPriority="70"/>
-    <w:lsdException w:name="Colorful Shading Accent 5" w:uiPriority="71"/>
-    <w:lsdException w:name="Colorful List Accent 5" w:uiPriority="72"/>
-    <w:lsdException w:name="Colorful Grid Accent 5" w:uiPriority="73"/>
-    <w:lsdException w:name="Light Shading Accent 6" w:uiPriority="60"/>
-    <w:lsdException w:name="Light List Accent 6" w:uiPriority="61"/>
-    <w:lsdException w:name="Light Grid Accent 6" w:uiPriority="62"/>
-    <w:lsdException w:name="Medium Shading 1 Accent 6" w:uiPriority="63"/>
-    <w:lsdException w:name="Medium Shading 2 Accent 6" w:uiPriority="64"/>
-    <w:lsdException w:name="Medium List 1 Accent 6" w:uiPriority="65"/>
-    <w:lsdException w:name="Medium List 2 Accent 6" w:uiPriority="66"/>
-    <w:lsdException w:name="Medium Grid 1 Accent 6" w:uiPriority="67"/>
-    <w:lsdException w:name="Medium Grid 2 Accent 6" w:uiPriority="68"/>
-    <w:lsdException w:name="Medium Grid 3 Accent 6" w:uiPriority="69"/>
-    <w:lsdException w:name="Dark List Accent 6" w:uiPriority="70"/>
-    <w:lsdException w:name="Colorful Shading Accent 6" w:uiPriority="71"/>
-    <w:lsdException w:name="Colorful List Accent 6" w:uiPriority="72"/>
-    <w:lsdException w:name="Colorful Grid Accent 6" w:uiPriority="73"/>
-    <w:lsdException w:name="Subtle Emphasis" w:uiPriority="19" w:qFormat="1"/>
-    <w:lsdException w:name="Intense Emphasis" w:uiPriority="21" w:qFormat="1"/>
-    <w:lsdException w:name="Subtle Reference" w:uiPriority="31" w:qFormat="1"/>
-    <w:lsdException w:name="Intense Reference" w:uiPriority="32" w:qFormat="1"/>
-    <w:lsdException w:name="Book Title" w:uiPriority="33" w:qFormat="1"/>
-    <w:lsdException w:name="Bibliography" w:semiHidden="1" w:uiPriority="37" w:unhideWhenUsed="1"/>
-    <w:lsdException w:name="TOC Heading" w:semiHidden="1" w:uiPriority="39" w:unhideWhenUsed="1" w:qFormat="1"/>
-    <w:lsdException w:name="Plain Table 1" w:uiPriority="41"/>
-    <w:lsdException w:name="Plain Table 2" w:uiPriority="42"/>
-    <w:lsdException w:name="Plain Table 3" w:uiPriority="43"/>
-    <w:lsdException w:name="Plain Table 4" w:uiPriority="44"/>
-    <w:lsdException w:name="Plain Table 5" w:uiPriority="45"/>
-    <w:lsdException w:name="Grid Table Light" w:uiPriority="40"/>
-    <w:lsdException w:name="Grid Table 1 Light" w:uiPriority="46"/>
-    <w:lsdException w:name="Grid Table 2" w:uiPriority="47"/>
-    <w:lsdException w:name="Grid Table 3" w:uiPriority="48"/>
-    <w:lsdException w:name="Grid Table 4" w:uiPriority="49"/>
-    <w:lsdException w:name="Grid Table 5 Dark" w:uiPriority="50"/>
-    <w:lsdException w:name="Grid Table 6 Colorful" w:uiPriority="51"/>
-    <w:lsdException w:name="Grid Table 7 Colorful" w:uiPriority="52"/>
-    <w:lsdException w:name="Grid Table 1 Light Accent 1" w:uiPriority="46"/>
-    <w:lsdException w:name="Grid Table 2 Accent 1" w:uiPriority="47"/>
-    <w:lsdException w:name="Grid Table 3 Accent 1" w:uiPriority="48"/>
-    <w:lsdException w:name="Grid Table 4 Accent 1" w:uiPriority="49"/>
-    <w:lsdException w:name="Grid Table 5 Dark Accent 1" w:uiPriority="50"/>
-    <w:lsdException w:name="Grid Table 6 Colorful Accent 1" w:uiPriority="51"/>
-    <w:lsdException w:name="Grid Table 7 Colorful Accent 1" w:uiPriority="52"/>
-    <w:lsdException w:name="Grid Table 1 Light Accent 2" w:uiPriority="46"/>
-    <w:lsdException w:name="Grid Table 2 Accent 2" w:uiPriority="47"/>
-    <w:lsdException w:name="Grid Table 3 Accent 2" w:uiPriority="48"/>
-    <w:lsdException w:name="Grid Table 4 Accent 2" w:uiPriority="49"/>
-    <w:lsdException w:name="Grid Table 5 Dark Accent 2" w:uiPriority="50"/>
-    <w:lsdException w:name="Grid Table 6 Colorful Accent 2" w:uiPriority="51"/>
-    <w:lsdException w:name="Grid Table 7 Colorful Accent 2" w:uiPriority="52"/>
-    <w:lsdException w:name="Grid Table 1 Light Accent 3" w:uiPriority="46"/>
-    <w:lsdException w:name="Grid Table 2 Accent 3" w:uiPriority="47"/>
-    <w:lsdException w:name="Grid Table 3 Accent 3" w:uiPriority="48"/>
-    <w:lsdException w:name="Grid Table 4 Accent 3" w:uiPriority="49"/>
-    <w:lsdException w:name="Grid Table 5 Dark Accent 3" w:uiPriority="50"/>
-    <w:lsdException w:name="Grid Table 6 Colorful Accent 3" w:uiPriority="51"/>
-    <w:lsdException w:name="Grid Table 7 Colorful Accent 3" w:uiPriority="52"/>
-    <w:lsdException w:name="Grid Table 1 Light Accent 4" w:uiPriority="46"/>
-    <w:lsdException w:name="Grid Table 2 Accent 4" w:uiPriority="47"/>
-    <w:lsdException w:name="Grid Table 3 Accent 4" w:uiPriority="48"/>
-    <w:lsdException w:name="Grid Table 4 Accent 4" w:uiPriority="49"/>
-    <w:lsdException w:name="Grid Table 5 Dark Accent 4" w:uiPriority="50"/>
-    <w:lsdException w:name="Grid Table 6 Colorful Accent 4" w:uiPriority="51"/>
-    <w:lsdException w:name="Grid Table 7 Colorful Accent 4" w:uiPriority="52"/>
-    <w:lsdException w:name="Grid Table 1 Light Accent 5" w:uiPriority="46"/>
-    <w:lsdException w:name="Grid Table 2 Accent 5" w:uiPriority="47"/>
-    <w:lsdException w:name="Grid Table 3 Accent 5" w:uiPriority="48"/>
-    <w:lsdException w:name="Grid Table 4 Accent 5" w:uiPriority="49"/>
-    <w:lsdException w:name="Grid Table 5 Dark Accent 5" w:uiPriority="50"/>
-    <w:lsdException w:name="Grid Table 6 Colorful Accent 5" w:uiPriority="51"/>
-    <w:lsdException w:name="Grid Table 7 Colorful Accent 5" w:uiPriority="52"/>
-    <w:lsdException w:name="Grid Table 1 Light Accent 6" w:uiPriority="46"/>
-    <w:lsdException w:name="Grid Table 2 Accent 6" w:uiPriority="47"/>
-    <w:lsdException w:name="Grid Table 3 Accent 6" w:uiPriority="48"/>
-    <w:lsdException w:name="Grid Table 4 Accent 6" w:uiPriority="49"/>
-    <w:lsdException w:name="Grid Table 5 Dark Accent 6" w:uiPriority="50"/>
-    <w:lsdException w:name="Grid Table 6 Colorful Accent 6" w:uiPriority="51"/>
-    <w:lsdException w:name="Grid Table 7 Colorful Accent 6" w:uiPriority="52"/>
-    <w:lsdException w:name="List Table 1 Light" w:uiPriority="46"/>
-    <w:lsdException w:name="List Table 2" w:uiPriority="47"/>
-    <w:lsdException w:name="List Table 3" w:uiPriority="48"/>
-    <w:lsdException w:name="List Table 4" w:uiPriority="49"/>
-    <w:lsdException w:name="List Table 5 Dark" w:uiPriority="50"/>
-    <w:lsdException w:name="List Table 6 Colorful" w:uiPriority="51"/>
-    <w:lsdException w:name="List Table 7 Colorful" w:uiPriority="52"/>
-    <w:lsdException w:name="List Table 1 Light Accent 1" w:uiPriority="46"/>
-    <w:lsdException w:name="List Table 2 Accent 1" w:uiPriority="47"/>
-    <w:lsdException w:name="List Table 3 Accent 1" w:uiPriority="48"/>
-    <w:lsdException w:name="List Table 4 Accent 1" w:uiPriority="49"/>
-    <w:lsdException w:name="List Table 5 Dark Accent 1" w:uiPriority="50"/>
-    <w:lsdException w:name="List Table 6 Colorful Accent 1" w:uiPriority="51"/>
-    <w:lsdException w:name="List Table 7 Colorful Accent 1" w:uiPriority="52"/>
-    <w:lsdException w:name="List Table 1 Light Accent 2" w:uiPriority="46"/>
-    <w:lsdException w:name="List Table 2 Accent 2" w:uiPriority="47"/>
-    <w:lsdException w:name="List Table 3 Accent 2" w:uiPriority="48"/>
-    <w:lsdException w:name="List Table 4 Accent 2" w:uiPriority="49"/>
-    <w:lsdException w:name="List Table 5 Dark Accent 2" w:uiPriority="50"/>
-    <w:lsdException w:name="List Table 6 Colorful Accent 2" w:uiPriority="51"/>
-    <w:lsdException w:name="List Table 7 Colorful Accent 2" w:uiPriority="52"/>
-    <w:lsdException w:name="List Table 1 Light Accent 3" w:uiPriority="46"/>
-    <w:lsdException w:name="List Table 2 Accent 3" w:uiPriority="47"/>
-    <w:lsdException w:name="List Table 3 Accent 3" w:uiPriority="48"/>
-    <w:lsdException w:name="List Table 4 Accent 3" w:uiPriority="49"/>
-    <w:lsdException w:name="List Table 5 Dark Accent 3" w:uiPriority="50"/>
-    <w:lsdException w:name="List Table 6 Colorful Accent 3" w:uiPriority="51"/>
-    <w:lsdException w:name="List Table 7 Colorful Accent 3" w:uiPriority="52"/>
-    <w:lsdException w:name="List Table 1 Light Accent 4" w:uiPriority="46"/>
-    <w:lsdException w:name="List Table 2 Accent 4" w:uiPriority="47"/>
-    <w:lsdException w:name="List Table 3 Accent 4" w:uiPriority="48"/>
-    <w:lsdException w:name="List Table 4 Accent 4" w:uiPriority="49"/>
-    <w:lsdException w:name="List Table 5 Dark Accent 4" w:uiPriority="50"/>
-    <w:lsdException w:name="List Table 6 Colorful Accent 4" w:uiPriority="51"/>
-    <w:lsdException w:name="List Table 7 Colorful Accent 4" w:uiPriority="52"/>
-    <w:lsdException w:name="List Table 1 Light Accent 5" w:uiPriority="46"/>
-    <w:lsdException w:name="List Table 2 Accent 5" w:uiPriority="47"/>
-    <w:lsdException w:name="List Table 3 Accent 5" w:uiPriority="48"/>
-    <w:lsdException w:name="List Table 4 Accent 5" w:uiPriority="49"/>
-    <w:lsdException w:name="List Table 5 Dark Accent 5" w:uiPriority="50"/>
-    <w:lsdException w:name="List Table 6 Colorful Accent 5" w:uiPriority="51"/>
-    <w:lsdException w:name="List Table 7 Colorful Accent 5" w:uiPriority="52"/>
-    <w:lsdException w:name="List Table 1 Light Accent 6" w:uiPriority="46"/>
-    <w:lsdException w:name="List Table 2 Accent 6" w:uiPriority="47"/>
-    <w:lsdException w:name="List Table 3 Accent 6" w:uiPriority="48"/>
-    <w:lsdException w:name="List Table 4 Accent 6" w:uiPriority="49"/>
-    <w:lsdException w:name="List Table 5 Dark Accent 6" w:uiPriority="50"/>
-    <w:lsdException w:name="List Table 6 Colorful Accent 6" w:uiPriority="51"/>
-    <w:lsdException w:name="List Table 7 Colorful Accent 6" w:uiPriority="52"/>
-  </w:latentStyles>
-  <w:style w:type="paragraph" w:default="1" w:styleId="Normal">
-    <w:name w:val="Normal"/>
-    <w:qFormat/>
-  </w:style>
-  <w:style w:type="character" w:default="1" w:styleId="Fuentedeprrafopredeter">
-    <w:name w:val="Default Paragraph Font"/>
-    <w:uiPriority w:val="1"/>
-    <w:semiHidden/>
-    <w:unhideWhenUsed/>
-  </w:style>
-  <w:style w:type="table" w:default="1" w:styleId="Tablanormal">
-    <w:name w:val="Normal Table"/>
-    <w:uiPriority w:val="99"/>
-    <w:semiHidden/>
-    <w:unhideWhenUsed/>
-    <w:tblPr>
-      <w:tblInd w:w="0" w:type="dxa"/>
-      <w:tblCellMar>
-        <w:top w:w="0" w:type="dxa"/>
-        <w:left w:w="108" w:type="dxa"/>
-        <w:bottom w:w="0" w:type="dxa"/>
-        <w:right w:w="108" w:type="dxa"/>
-      </w:tblCellMar>
-    </w:tblPr>
-  </w:style>
-  <w:style w:type="numbering" w:default="1" w:styleId="Sinlista">
-    <w:name w:val="No List"/>
-    <w:uiPriority w:val="99"/>
-    <w:semiHidden/>
-    <w:unhideWhenUsed/>
-  </w:style>
-</w:styles>
-</file>
-
-<file path=word/glossary/webSettings.xml><?xml version="1.0" encoding="utf-8"?>
-<w:webSettings xmlns:mc="http://schemas.openxmlformats.org/markup-compatibility/2006" xmlns:r="http://schemas.openxmlformats.org/officeDocument/2006/relationships" xmlns:w="http://schemas.openxmlformats.org/wordprocessingml/2006/main" xmlns:w14="http://schemas.microsoft.com/office/word/2010/wordml" xmlns:w15="http://schemas.microsoft.com/office/word/2012/wordml" xmlns:w16se="http://schemas.microsoft.com/office/word/2015/wordml/symex" mc:Ignorable="w14 w15 w16se"/>
 </file>
 
 <file path=word/theme/theme1.xml><?xml version="1.0" encoding="utf-8"?>
@@ -9132,9 +8664,7 @@
 </file>
 
 <file path=customXml/item2.xml><?xml version="1.0" encoding="utf-8"?>
-<p:properties xmlns:p="http://schemas.microsoft.com/office/2006/metadata/properties" xmlns:xsi="http://www.w3.org/2001/XMLSchema-instance" xmlns:pc="http://schemas.microsoft.com/office/infopath/2007/PartnerControls">
-  <documentManagement/>
-</p:properties>
+<b:Sources xmlns:b="http://schemas.openxmlformats.org/officeDocument/2006/bibliography" xmlns="http://schemas.openxmlformats.org/officeDocument/2006/bibliography" SelectedStyle="\APASixthEditionOfficeOnline.xsl" StyleName="APA" Version="6"/>
 </file>
 
 <file path=customXml/item3.xml><?xml version="1.0" encoding="utf-8"?>
@@ -9147,7 +8677,9 @@
 </file>
 
 <file path=customXml/item4.xml><?xml version="1.0" encoding="utf-8"?>
-<b:Sources xmlns:b="http://schemas.openxmlformats.org/officeDocument/2006/bibliography" xmlns="http://schemas.openxmlformats.org/officeDocument/2006/bibliography" SelectedStyle="\APASixthEditionOfficeOnline.xsl" StyleName="APA" Version="6"/>
+<p:properties xmlns:p="http://schemas.microsoft.com/office/2006/metadata/properties" xmlns:xsi="http://www.w3.org/2001/XMLSchema-instance" xmlns:pc="http://schemas.microsoft.com/office/infopath/2007/PartnerControls">
+  <documentManagement/>
+</p:properties>
 </file>
 
 <file path=customXml/itemProps1.xml><?xml version="1.0" encoding="utf-8"?>
@@ -9169,17 +8701,9 @@
 </file>
 
 <file path=customXml/itemProps2.xml><?xml version="1.0" encoding="utf-8"?>
-<ds:datastoreItem xmlns:ds="http://schemas.openxmlformats.org/officeDocument/2006/customXml" ds:itemID="{5F1783E3-BA1C-4CA3-8E32-C9B378BBED03}">
+<ds:datastoreItem xmlns:ds="http://schemas.openxmlformats.org/officeDocument/2006/customXml" ds:itemID="{FBD61725-A60E-40F3-AB5D-0E7F797DD77D}">
   <ds:schemaRefs>
-    <ds:schemaRef ds:uri="http://schemas.openxmlformats.org/package/2006/metadata/core-properties"/>
-    <ds:schemaRef ds:uri="http://schemas.microsoft.com/office/infopath/2007/PartnerControls"/>
-    <ds:schemaRef ds:uri="http://purl.org/dc/elements/1.1/"/>
-    <ds:schemaRef ds:uri="http://schemas.microsoft.com/office/2006/documentManagement/types"/>
-    <ds:schemaRef ds:uri="http://schemas.microsoft.com/office/2006/metadata/properties"/>
-    <ds:schemaRef ds:uri="126e8a1c-9ea9-435a-ac89-d06c80d62e30"/>
-    <ds:schemaRef ds:uri="http://purl.org/dc/terms/"/>
-    <ds:schemaRef ds:uri="http://purl.org/dc/dcmitype/"/>
-    <ds:schemaRef ds:uri="http://www.w3.org/XML/1998/namespace"/>
+    <ds:schemaRef ds:uri="http://schemas.openxmlformats.org/officeDocument/2006/bibliography"/>
   </ds:schemaRefs>
 </ds:datastoreItem>
 </file>
@@ -9193,9 +8717,10 @@
 </file>
 
 <file path=customXml/itemProps4.xml><?xml version="1.0" encoding="utf-8"?>
-<ds:datastoreItem xmlns:ds="http://schemas.openxmlformats.org/officeDocument/2006/customXml" ds:itemID="{FBD61725-A60E-40F3-AB5D-0E7F797DD77D}">
+<ds:datastoreItem xmlns:ds="http://schemas.openxmlformats.org/officeDocument/2006/customXml" ds:itemID="{5F1783E3-BA1C-4CA3-8E32-C9B378BBED03}">
   <ds:schemaRefs>
-    <ds:schemaRef ds:uri="http://schemas.openxmlformats.org/officeDocument/2006/bibliography"/>
+    <ds:schemaRef ds:uri="http://schemas.microsoft.com/office/2006/metadata/properties"/>
+    <ds:schemaRef ds:uri="http://schemas.microsoft.com/office/infopath/2007/PartnerControls"/>
   </ds:schemaRefs>
 </ds:datastoreItem>
 </file>
</xml_diff>